<commit_message>
updating sp counts in manu
</commit_message>
<xml_diff>
--- a/docs/01_manuscript1/01_manu/manu-v7.docx
+++ b/docs/01_manuscript1/01_manu/manu-v7.docx
@@ -23,7 +23,7 @@
           <w:bCs/>
           <w:lang w:val="en-US"/>
         </w:rPr>
-        <w:t xml:space="preserve">Using </w:t>
+        <w:t>M</w:t>
       </w:r>
       <w:r>
         <w:rPr>
@@ -32,7 +32,7 @@
           <w:bCs/>
           <w:lang w:val="en-US"/>
         </w:rPr>
-        <w:t>multi</w:t>
+        <w:t>ulti</w:t>
       </w:r>
       <w:r>
         <w:rPr>
@@ -41,7 +41,25 @@
           <w:bCs/>
           <w:lang w:val="en-US"/>
         </w:rPr>
-        <w:t xml:space="preserve">ple criteria to evaluate </w:t>
+        <w:t>ple criteria evaluat</w:t>
+      </w:r>
+      <w:r>
+        <w:rPr>
+          <w:rFonts w:ascii="Calibri" w:hAnsi="Calibri" w:cs="Calibri"/>
+          <w:b/>
+          <w:bCs/>
+          <w:lang w:val="en-US"/>
+        </w:rPr>
+        <w:t>ion of</w:t>
+      </w:r>
+      <w:r>
+        <w:rPr>
+          <w:rFonts w:ascii="Calibri" w:hAnsi="Calibri" w:cs="Calibri"/>
+          <w:b/>
+          <w:bCs/>
+          <w:lang w:val="en-US"/>
+        </w:rPr>
+        <w:t xml:space="preserve"> </w:t>
       </w:r>
       <w:r>
         <w:rPr>
@@ -232,7 +250,32 @@
           <w:bCs/>
           <w:lang w:val="fr-CA"/>
         </w:rPr>
-        <w:t xml:space="preserve"> Bo Melander</w:t>
+        <w:t>, Simon Riley</w:t>
+      </w:r>
+      <w:r>
+        <w:rPr>
+          <w:b/>
+          <w:bCs/>
+          <w:vertAlign w:val="superscript"/>
+          <w:lang w:val="fr-CA"/>
+        </w:rPr>
+        <w:t>1</w:t>
+      </w:r>
+      <w:r>
+        <w:rPr>
+          <w:b/>
+          <w:bCs/>
+          <w:lang w:val="fr-CA"/>
+        </w:rPr>
+        <w:t xml:space="preserve">, </w:t>
+      </w:r>
+      <w:r>
+        <w:rPr>
+          <w:b/>
+          <w:bCs/>
+          <w:lang w:val="fr-CA"/>
+        </w:rPr>
+        <w:t>Bo Melander</w:t>
       </w:r>
       <w:r>
         <w:rPr>
@@ -10722,10 +10765,16 @@
         <w:t xml:space="preserve"> (1.6-1.7 times more weeds), but the patterns were the same. </w:t>
       </w:r>
       <w:r>
+        <w:t xml:space="preserve">On average there were twice as many weeds in 2019 (mean:163, SE:10) compared to 2020 (mean:76, SE:5).  </w:t>
+      </w:r>
+      <w:r>
+        <w:t>On average, t</w:t>
+      </w:r>
+      <w:r>
         <w:rPr>
           <w:highlight w:val="yellow"/>
         </w:rPr>
-        <w:t>The total number of weeds was highest in the inversion tillage systems</w:t>
+        <w:t>he total number of weeds was highest in the inversion tillage systems</w:t>
       </w:r>
       <w:r>
         <w:rPr>
@@ -10737,13 +10786,13 @@
         <w:rPr>
           <w:highlight w:val="yellow"/>
         </w:rPr>
-        <w:t>xx</w:t>
+        <w:t xml:space="preserve">174 </w:t>
       </w:r>
       <w:r>
         <w:rPr>
           <w:highlight w:val="yellow"/>
         </w:rPr>
-        <w:t xml:space="preserve"> plants m</w:t>
+        <w:t>plants m</w:t>
       </w:r>
       <w:r>
         <w:rPr>
@@ -10762,7 +10811,7 @@
         <w:rPr>
           <w:highlight w:val="yellow"/>
         </w:rPr>
-        <w:t>xx</w:t>
+        <w:t>14</w:t>
       </w:r>
       <w:r>
         <w:rPr>
@@ -10786,7 +10835,7 @@
         <w:rPr>
           <w:highlight w:val="yellow"/>
         </w:rPr>
-        <w:t>xx</w:t>
+        <w:t>109</w:t>
       </w:r>
       <w:r>
         <w:rPr>
@@ -10811,7 +10860,7 @@
         <w:rPr>
           <w:highlight w:val="yellow"/>
         </w:rPr>
-        <w:t>xx</w:t>
+        <w:t>9</w:t>
       </w:r>
       <w:r>
         <w:rPr>
@@ -10835,7 +10884,7 @@
         <w:rPr>
           <w:highlight w:val="yellow"/>
         </w:rPr>
-        <w:t>xx</w:t>
+        <w:t>55</w:t>
       </w:r>
       <w:r>
         <w:rPr>
@@ -10860,148 +10909,63 @@
         <w:rPr>
           <w:highlight w:val="yellow"/>
         </w:rPr>
-        <w:t>xx</w:t>
+        <w:t>5</w:t>
       </w:r>
       <w:r>
         <w:rPr>
           <w:highlight w:val="yellow"/>
         </w:rPr>
-        <w:t>)</w:t>
-      </w:r>
-      <w:r>
-        <w:t>. T</w:t>
-      </w:r>
-      <w:r>
-        <w:t>h</w:t>
-      </w:r>
-      <w:r>
-        <w:t>is pattern</w:t>
-      </w:r>
-      <w:r>
-        <w:t xml:space="preserve"> w</w:t>
-      </w:r>
-      <w:r>
-        <w:t>as</w:t>
-      </w:r>
-      <w:r>
-        <w:t xml:space="preserve"> magnified in 2019 compared to 2020, and in 2020 the difference between no-till and surface tillage was </w:t>
-      </w:r>
-      <w:r>
-        <w:t xml:space="preserve">only </w:t>
-      </w:r>
-      <w:r>
-        <w:t>borderline significant (p = 0.06). On average, inversion tillage had three and two times more spring weeds compared to the surface and no-till systems, respectively</w:t>
-      </w:r>
-      <w:r>
-        <w:t xml:space="preserve"> (</w:t>
+        <w:t xml:space="preserve">; </w:t>
       </w:r>
       <w:r>
         <w:rPr>
           <w:b/>
           <w:bCs/>
+          <w:highlight w:val="yellow"/>
         </w:rPr>
         <w:t>Figure 4</w:t>
       </w:r>
       <w:r>
+        <w:rPr>
+          <w:highlight w:val="yellow"/>
+        </w:rPr>
         <w:t>)</w:t>
       </w:r>
       <w:r>
-        <w:t>.</w:t>
-      </w:r>
-      <w:r>
-        <w:t xml:space="preserve"> The largest observed differences in total spring weed counts were in the no-till system, with MixE having 1.5-1.7 times more weeds compared to the other cover crop treatments.</w:t>
-      </w:r>
-    </w:p>
-    <w:p>
-      <w:pPr>
-        <w:spacing w:line="360" w:lineRule="auto"/>
-      </w:pPr>
-      <w:r>
-        <w:t>Despite having less total weeds, b</w:t>
-      </w:r>
-      <w:r>
-        <w:t xml:space="preserve">oth no-till and surface tillage had significantly increased numbers of perennial weeds compared to inversion tillage. </w:t>
-      </w:r>
-      <w:r>
-        <w:t xml:space="preserve">The perennial weeds were mainly CIRAR (82%, versus 18% EQUAR). </w:t>
-      </w:r>
-      <w:r>
-        <w:t>Averaged over no-till and surface tillage treatments, t</w:t>
-      </w:r>
-      <w:r>
-        <w:t xml:space="preserve">he </w:t>
-      </w:r>
-      <w:r>
-        <w:lastRenderedPageBreak/>
-        <w:t>number of</w:t>
-      </w:r>
-      <w:r>
-        <w:t xml:space="preserve"> perennial weeds </w:t>
-      </w:r>
-      <w:r>
-        <w:t xml:space="preserve">in the MixE </w:t>
-      </w:r>
-      <w:r>
-        <w:t>was</w:t>
+        <w:t xml:space="preserve">. This </w:t>
+      </w:r>
+      <w:r>
+        <w:t>pattern</w:t>
+      </w:r>
+      <w:r>
+        <w:t xml:space="preserve"> w</w:t>
+      </w:r>
+      <w:r>
+        <w:t>as</w:t>
       </w:r>
       <w:r>
         <w:t xml:space="preserve"> </w:t>
       </w:r>
       <w:r>
-        <w:t>11 times higher (SE:6; p&lt;0.001) compared to the t</w:t>
-      </w:r>
-      <w:r>
-        <w:t>he NoCC treatment</w:t>
-      </w:r>
-      <w:r>
-        <w:t>, and 2.6-8.6 times higher than the other cover crop treatments</w:t>
-      </w:r>
-      <w:r>
-        <w:t>; these effects were erased in the inversion tillage treatment</w:t>
-      </w:r>
-      <w:r>
-        <w:t>.</w:t>
-      </w:r>
-      <w:r>
-        <w:t xml:space="preserve"> The MixM had a borderline significant increase in perennial weeds compared to the NoCC (p=0.05), but all other treatments were not significantly different from the NoCC.</w:t>
-      </w:r>
-      <w:r>
-        <w:t xml:space="preserve"> </w:t>
-      </w:r>
-      <w:r>
-        <w:t>The correlation between faba bean yields and annual weeds was not significant</w:t>
-      </w:r>
-      <w:r>
-        <w:t xml:space="preserve"> (ρ=0.002, p=0.98)</w:t>
-      </w:r>
-      <w:r>
-        <w:t xml:space="preserve">, while the correlation </w:t>
-      </w:r>
-      <w:r>
-        <w:t>between yields and</w:t>
-      </w:r>
-      <w:r>
-        <w:t xml:space="preserve"> perennial weeds was</w:t>
-      </w:r>
-      <w:r>
-        <w:t xml:space="preserve"> highly significant (ρ=-0.28, p&lt;0.001), with more perennial weeds corresponding to lower faba bean yields</w:t>
-      </w:r>
-      <w:r>
-        <w:t xml:space="preserve"> (</w:t>
-      </w:r>
-      <w:r>
-        <w:rPr>
-          <w:b/>
-          <w:bCs/>
-        </w:rPr>
-        <w:t>Figure 4</w:t>
-      </w:r>
-      <w:r>
-        <w:t>)</w:t>
-      </w:r>
-      <w:r>
-        <w:t>.</w:t>
-      </w:r>
+        <w:t xml:space="preserve">consistent in both years, but was </w:t>
+      </w:r>
+      <w:r>
+        <w:t xml:space="preserve">magnified in 2019 </w:t>
+      </w:r>
+      <w:r>
+        <w:t>(when there were more weeds)</w:t>
+      </w:r>
+      <w:r>
+        <w:t xml:space="preserve">. </w:t>
+      </w:r>
+      <w:r>
+        <w:t>The largest observed differences in total spring weed counts were in the no-till system, with MixE having 1.5-1.7 times more weeds compared to the other cover crop treatments.</w:t>
+      </w:r>
+    </w:p>
+    <w:p>
+      <w:pPr>
+        <w:spacing w:line="360" w:lineRule="auto"/>
+      </w:pPr>
     </w:p>
     <w:tbl>
       <w:tblPr>
@@ -11032,17 +10996,17 @@
                 <w:lang w:val="da-DK"/>
               </w:rPr>
             </w:pPr>
-            <w:commentRangeStart w:id="6"/>
             <w:r>
               <w:rPr>
                 <w:noProof/>
                 <w:lang w:val="da-DK"/>
               </w:rPr>
+              <w:lastRenderedPageBreak/>
               <w:drawing>
-                <wp:inline distT="0" distB="0" distL="0" distR="0" wp14:anchorId="09C9707F" wp14:editId="024C5E7E">
+                <wp:inline distT="0" distB="0" distL="0" distR="0" wp14:anchorId="5FE08851" wp14:editId="7C021613">
                   <wp:extent cx="5731510" cy="6550025"/>
                   <wp:effectExtent l="0" t="0" r="2540" b="3175"/>
-                  <wp:docPr id="1726684798" name="Picture 2"/>
+                  <wp:docPr id="1118005148" name="Picture 1"/>
                   <wp:cNvGraphicFramePr>
                     <a:graphicFrameLocks xmlns:a="http://schemas.openxmlformats.org/drawingml/2006/main" noChangeAspect="1"/>
                   </wp:cNvGraphicFramePr>
@@ -11050,10 +11014,8 @@
                     <a:graphicData uri="http://schemas.openxmlformats.org/drawingml/2006/picture">
                       <pic:pic xmlns:pic="http://schemas.openxmlformats.org/drawingml/2006/picture">
                         <pic:nvPicPr>
-                          <pic:cNvPr id="0" name="Picture 6"/>
-                          <pic:cNvPicPr>
-                            <a:picLocks noChangeAspect="1" noChangeArrowheads="1"/>
-                          </pic:cNvPicPr>
+                          <pic:cNvPr id="1118005148" name="Picture 1118005148"/>
+                          <pic:cNvPicPr/>
                         </pic:nvPicPr>
                         <pic:blipFill>
                           <a:blip r:embed="rId16" cstate="print">
@@ -11063,12 +11025,11 @@
                               </a:ext>
                             </a:extLst>
                           </a:blip>
-                          <a:srcRect/>
                           <a:stretch>
                             <a:fillRect/>
                           </a:stretch>
                         </pic:blipFill>
-                        <pic:spPr bwMode="auto">
+                        <pic:spPr>
                           <a:xfrm>
                             <a:off x="0" y="0"/>
                             <a:ext cx="5731510" cy="6550025"/>
@@ -11076,26 +11037,12 @@
                           <a:prstGeom prst="rect">
                             <a:avLst/>
                           </a:prstGeom>
-                          <a:noFill/>
-                          <a:ln>
-                            <a:noFill/>
-                          </a:ln>
                         </pic:spPr>
                       </pic:pic>
                     </a:graphicData>
                   </a:graphic>
                 </wp:inline>
               </w:drawing>
-            </w:r>
-            <w:commentRangeEnd w:id="6"/>
-            <w:r>
-              <w:rPr>
-                <w:rStyle w:val="CommentReference"/>
-                <w:sz w:val="24"/>
-                <w:szCs w:val="24"/>
-                <w:lang w:val="da-DK"/>
-              </w:rPr>
-              <w:commentReference w:id="6"/>
             </w:r>
           </w:p>
         </w:tc>
@@ -11118,7 +11065,6 @@
                 <w:b/>
                 <w:bCs/>
               </w:rPr>
-              <w:lastRenderedPageBreak/>
               <w:t xml:space="preserve">Figure </w:t>
             </w:r>
             <w:r>
@@ -11143,50 +11089,40 @@
               <w:t xml:space="preserve"> </w:t>
             </w:r>
             <w:r>
-              <w:rPr>
-                <w:i/>
-                <w:iCs/>
-              </w:rPr>
-              <w:t xml:space="preserve">(Top) </w:t>
-            </w:r>
-            <w:r>
-              <w:t>T</w:t>
+              <w:t xml:space="preserve">There were no differences in total or perennial weed counts within the inversion tillage treatment (Inv), but in </w:t>
+            </w:r>
+            <w:r>
+              <w:t>the no-till and surface</w:t>
+            </w:r>
+            <w:r>
+              <w:t xml:space="preserve"> (Surf)</w:t>
+            </w:r>
+            <w:r>
+              <w:t xml:space="preserve"> tillage systems </w:t>
+            </w:r>
+            <w:r>
+              <w:t>t</w:t>
             </w:r>
             <w:r>
               <w:t xml:space="preserve">he early-planted mix </w:t>
             </w:r>
             <w:r>
-              <w:t>in the no-till and surface tillage systems had significantly higher total weeds as well as perennial weed counts compared to the other cover crop systems, reflecting its different herbicide program (Table 2)</w:t>
+              <w:t>had significantly higher perennial weed counts</w:t>
+            </w:r>
+            <w:r>
+              <w:t>,</w:t>
+            </w:r>
+            <w:r>
+              <w:t xml:space="preserve"> reflecting its different herbicide program</w:t>
+            </w:r>
+            <w:r>
+              <w:t xml:space="preserve"> compared to other cover crop systems</w:t>
+            </w:r>
+            <w:r>
+              <w:t xml:space="preserve"> (Table 2)</w:t>
             </w:r>
             <w:r>
               <w:t>.</w:t>
-            </w:r>
-            <w:r>
-              <w:rPr>
-                <w:b/>
-                <w:bCs/>
-              </w:rPr>
-              <w:t xml:space="preserve"> </w:t>
-            </w:r>
-            <w:r>
-              <w:rPr>
-                <w:i/>
-                <w:iCs/>
-              </w:rPr>
-              <w:t>(Bottom)</w:t>
-            </w:r>
-            <w:r>
-              <w:rPr>
-                <w:i/>
-                <w:iCs/>
-              </w:rPr>
-              <w:t xml:space="preserve"> </w:t>
-            </w:r>
-            <w:r>
-              <w:t>Perennial weed counts in the spring were negatively correlated with f</w:t>
-            </w:r>
-            <w:r>
-              <w:t>aba bean grain yields.</w:t>
             </w:r>
           </w:p>
         </w:tc>
@@ -11200,6 +11136,48 @@
     <w:p>
       <w:pPr>
         <w:spacing w:line="360" w:lineRule="auto"/>
+      </w:pPr>
+      <w:r>
+        <w:t xml:space="preserve">Despite having less total weeds, both no-till and surface tillage had significantly increased numbers of perennial weeds compared to inversion tillage. The perennial weeds were mainly CIRAR (82%, versus 18% EQUAR). Averaged over no-till and surface tillage treatments, the </w:t>
+      </w:r>
+      <w:r>
+        <w:lastRenderedPageBreak/>
+        <w:t xml:space="preserve">number of perennial weeds in the MixE was 11 times higher (SE:6; p&lt;0.001) compared to the the NoCC treatment, and 2.6-8.6 times higher than the other cover crop treatments; these effects were erased in the inversion tillage treatment. The MixM had a borderline significant increase in perennial weeds compared to the NoCC </w:t>
+      </w:r>
+      <w:r>
+        <w:t xml:space="preserve">in the no-till system </w:t>
+      </w:r>
+      <w:r>
+        <w:t>(p=0.05), but all other treatments were not significantly different from the NoCC. The</w:t>
+      </w:r>
+      <w:r>
+        <w:t xml:space="preserve">re was an inverse relationship between </w:t>
+      </w:r>
+      <w:r>
+        <w:t xml:space="preserve">faba bean yields </w:t>
+      </w:r>
+      <w:r>
+        <w:t xml:space="preserve">and perennial </w:t>
+      </w:r>
+      <w:r>
+        <w:t xml:space="preserve">weeds, with more perennial weeds corresponding to lower faba bean yields </w:t>
+      </w:r>
+      <w:r>
+        <w:t xml:space="preserve">(see </w:t>
+      </w:r>
+      <w:r>
+        <w:t>supporting information</w:t>
+      </w:r>
+      <w:r>
+        <w:t>)</w:t>
+      </w:r>
+      <w:r>
+        <w:t>.</w:t>
+      </w:r>
+    </w:p>
+    <w:p>
+      <w:pPr>
+        <w:spacing w:line="360" w:lineRule="auto"/>
         <w:rPr>
           <w:b/>
           <w:bCs/>
@@ -11311,7 +11289,7 @@
         <w:t>), while the system with the lowest overall value was the mid-season planted mixture (MixM) implemented in a no-till system with residue removal. Across tillage and residue management systems, the RadM was the best performing cover crop treatment, and the MixM the worst.</w:t>
       </w:r>
       <w:r>
-        <w:t xml:space="preserve"> The early-planted mixture (MixE) performed well in the inversion tillage system, but poorly in the other tillage systems. The impact of residue management system on the total value was marginal in the inversion tillage system, but residue retention in the </w:t>
+        <w:t xml:space="preserve"> The early-planted mixture (MixE) performed well in the inversion tillage system, but poorly in the other tillage systems. The impact of residue management on the total value was marginal in the inversion tillage system, but residue retention in the </w:t>
       </w:r>
       <w:r>
         <w:t xml:space="preserve">surface and no-till systems increased total value. </w:t>
@@ -11527,7 +11505,13 @@
         <w:t>], but the maximum grain yields observed each year exceeded the national averages</w:t>
       </w:r>
       <w:r>
-        <w:t>, demonstrating our results are reasonably representative of production environments.</w:t>
+        <w:t xml:space="preserve">, demonstrating </w:t>
+      </w:r>
+      <w:r>
+        <w:t>the study</w:t>
+      </w:r>
+      <w:r>
+        <w:t xml:space="preserve"> results are reasonably representative of production environments.</w:t>
       </w:r>
       <w:r>
         <w:t xml:space="preserve"> While the study was only in place for three cash crop cycles, the weather years represented a range of conditions that provide a reasonable amount of inference space</w:t>
@@ -12044,7 +12028,7 @@
       <w:pPr>
         <w:spacing w:line="360" w:lineRule="auto"/>
       </w:pPr>
-      <w:commentRangeStart w:id="7"/>
+      <w:commentRangeStart w:id="6"/>
       <w:r>
         <w:t xml:space="preserve">The study formed part of the EU Project </w:t>
       </w:r>
@@ -12069,14 +12053,14 @@
       <w:r>
         <w:t xml:space="preserve"> The authors acknowledge the contributions of Eugene Driessen, Karen XX, XXX who collected all data presented and whose field and laboratory expertise contributed significantly to this work. </w:t>
       </w:r>
-      <w:commentRangeEnd w:id="7"/>
+      <w:commentRangeEnd w:id="6"/>
       <w:r>
         <w:rPr>
           <w:rStyle w:val="CommentReference"/>
           <w:sz w:val="24"/>
           <w:szCs w:val="24"/>
         </w:rPr>
-        <w:commentReference w:id="7"/>
+        <w:commentReference w:id="6"/>
       </w:r>
     </w:p>
     <w:p>
@@ -14105,23 +14089,7 @@
       </w:r>
     </w:p>
   </w:comment>
-  <w:comment w:id="6" w:author="Virginia Anne Nichols" w:date="2026-01-27T14:41:00Z" w:initials="VN">
-    <w:p>
-      <w:pPr>
-        <w:pStyle w:val="CommentText"/>
-      </w:pPr>
-      <w:r>
-        <w:rPr>
-          <w:rStyle w:val="CommentReference"/>
-        </w:rPr>
-        <w:annotationRef/>
-      </w:r>
-      <w:r>
-        <w:t>The units on the bottom figures might be wrong (might have added the subplots)</w:t>
-      </w:r>
-    </w:p>
-  </w:comment>
-  <w:comment w:id="7" w:author="Virginia Anne Nichols" w:date="2025-11-26T10:39:00Z" w:initials="VN">
+  <w:comment w:id="6" w:author="Virginia Anne Nichols" w:date="2025-11-26T10:39:00Z" w:initials="VN">
     <w:p>
       <w:pPr>
         <w:pStyle w:val="CommentText"/>
@@ -14144,7 +14112,6 @@
 <w15:commentsEx xmlns:wpc="http://schemas.microsoft.com/office/word/2010/wordprocessingCanvas" xmlns:cx="http://schemas.microsoft.com/office/drawing/2014/chartex" xmlns:cx1="http://schemas.microsoft.com/office/drawing/2015/9/8/chartex" xmlns:cx2="http://schemas.microsoft.com/office/drawing/2015/10/21/chartex" xmlns:cx3="http://schemas.microsoft.com/office/drawing/2016/5/9/chartex" xmlns:cx4="http://schemas.microsoft.com/office/drawing/2016/5/10/chartex" xmlns:cx5="http://schemas.microsoft.com/office/drawing/2016/5/11/chartex" xmlns:cx6="http://schemas.microsoft.com/office/drawing/2016/5/12/chartex" xmlns:cx7="http://schemas.microsoft.com/office/drawing/2016/5/13/chartex" xmlns:cx8="http://schemas.microsoft.com/office/drawing/2016/5/14/chartex" xmlns:mc="http://schemas.openxmlformats.org/markup-compatibility/2006" xmlns:aink="http://schemas.microsoft.com/office/drawing/2016/ink" xmlns:am3d="http://schemas.microsoft.com/office/drawing/2017/model3d" xmlns:o="urn:schemas-microsoft-com:office:office" xmlns:oel="http://schemas.microsoft.com/office/2019/extlst" xmlns:r="http://schemas.openxmlformats.org/officeDocument/2006/relationships" xmlns:m="http://schemas.openxmlformats.org/officeDocument/2006/math" xmlns:v="urn:schemas-microsoft-com:vml" xmlns:wp14="http://schemas.microsoft.com/office/word/2010/wordprocessingDrawing" xmlns:wp="http://schemas.openxmlformats.org/drawingml/2006/wordprocessingDrawing" xmlns:w10="urn:schemas-microsoft-com:office:word" xmlns:w="http://schemas.openxmlformats.org/wordprocessingml/2006/main" xmlns:w14="http://schemas.microsoft.com/office/word/2010/wordml" xmlns:w15="http://schemas.microsoft.com/office/word/2012/wordml" xmlns:w16cex="http://schemas.microsoft.com/office/word/2018/wordml/cex" xmlns:w16cid="http://schemas.microsoft.com/office/word/2016/wordml/cid" xmlns:w16="http://schemas.microsoft.com/office/word/2018/wordml" xmlns:w16du="http://schemas.microsoft.com/office/word/2023/wordml/word16du" xmlns:w16sdtdh="http://schemas.microsoft.com/office/word/2020/wordml/sdtdatahash" xmlns:w16sdtfl="http://schemas.microsoft.com/office/word/2024/wordml/sdtformatlock" xmlns:w16se="http://schemas.microsoft.com/office/word/2015/wordml/symex" xmlns:wpg="http://schemas.microsoft.com/office/word/2010/wordprocessingGroup" xmlns:wpi="http://schemas.microsoft.com/office/word/2010/wordprocessingInk" xmlns:wne="http://schemas.microsoft.com/office/word/2006/wordml" xmlns:wps="http://schemas.microsoft.com/office/word/2010/wordprocessingShape" mc:Ignorable="w14 w15 w16se w16cid w16 w16cex w16sdtdh w16sdtfl w16du wp14">
   <w15:commentEx w15:paraId="7A375AD7" w15:done="0"/>
   <w15:commentEx w15:paraId="302ABAD3" w15:done="0"/>
-  <w15:commentEx w15:paraId="759A5C47" w15:done="0"/>
   <w15:commentEx w15:paraId="30569D99" w15:done="0"/>
 </w15:commentsEx>
 </file>
@@ -14153,7 +14120,6 @@
 <w16cex:commentsExtensible xmlns:wpc="http://schemas.microsoft.com/office/word/2010/wordprocessingCanvas" xmlns:cx="http://schemas.microsoft.com/office/drawing/2014/chartex" xmlns:cx1="http://schemas.microsoft.com/office/drawing/2015/9/8/chartex" xmlns:cx2="http://schemas.microsoft.com/office/drawing/2015/10/21/chartex" xmlns:cx3="http://schemas.microsoft.com/office/drawing/2016/5/9/chartex" xmlns:cx4="http://schemas.microsoft.com/office/drawing/2016/5/10/chartex" xmlns:cx5="http://schemas.microsoft.com/office/drawing/2016/5/11/chartex" xmlns:cx6="http://schemas.microsoft.com/office/drawing/2016/5/12/chartex" xmlns:cx7="http://schemas.microsoft.com/office/drawing/2016/5/13/chartex" xmlns:cx8="http://schemas.microsoft.com/office/drawing/2016/5/14/chartex" xmlns:cr="http://schemas.microsoft.com/office/comments/2020/reactions" xmlns:mc="http://schemas.openxmlformats.org/markup-compatibility/2006" xmlns:aink="http://schemas.microsoft.com/office/drawing/2016/ink" xmlns:am3d="http://schemas.microsoft.com/office/drawing/2017/model3d" xmlns:o="urn:schemas-microsoft-com:office:office" xmlns:oel="http://schemas.microsoft.com/office/2019/extlst" xmlns:r="http://schemas.openxmlformats.org/officeDocument/2006/relationships" xmlns:m="http://schemas.openxmlformats.org/officeDocument/2006/math" xmlns:v="urn:schemas-microsoft-com:vml" xmlns:wp14="http://schemas.microsoft.com/office/word/2010/wordprocessingDrawing" xmlns:wp="http://schemas.openxmlformats.org/drawingml/2006/wordprocessingDrawing" xmlns:w10="urn:schemas-microsoft-com:office:word" xmlns:w="http://schemas.openxmlformats.org/wordprocessingml/2006/main" xmlns:w14="http://schemas.microsoft.com/office/word/2010/wordml" xmlns:w15="http://schemas.microsoft.com/office/word/2012/wordml" xmlns:w16cex="http://schemas.microsoft.com/office/word/2018/wordml/cex" xmlns:w16cid="http://schemas.microsoft.com/office/word/2016/wordml/cid" xmlns:w16="http://schemas.microsoft.com/office/word/2018/wordml" xmlns:w16du="http://schemas.microsoft.com/office/word/2023/wordml/word16du" xmlns:w16sdtdh="http://schemas.microsoft.com/office/word/2020/wordml/sdtdatahash" xmlns:w16sdtfl="http://schemas.microsoft.com/office/word/2024/wordml/sdtformatlock" xmlns:w16se="http://schemas.microsoft.com/office/word/2015/wordml/symex" xmlns:wpg="http://schemas.microsoft.com/office/word/2010/wordprocessingGroup" xmlns:wpi="http://schemas.microsoft.com/office/word/2010/wordprocessingInk" xmlns:wne="http://schemas.microsoft.com/office/word/2006/wordml" xmlns:wps="http://schemas.microsoft.com/office/word/2010/wordprocessingShape" mc:Ignorable="w14 w15 w16se w16cid w16 w16cex w16sdtdh w16sdtfl cr w16du wp14">
   <w16cex:commentExtensible w16cex:durableId="0C976B4B" w16cex:dateUtc="2026-01-22T07:32:00Z"/>
   <w16cex:commentExtensible w16cex:durableId="33B89A46" w16cex:dateUtc="2026-01-22T08:16:00Z"/>
-  <w16cex:commentExtensible w16cex:durableId="7DFD975E" w16cex:dateUtc="2026-01-27T13:41:00Z"/>
   <w16cex:commentExtensible w16cex:durableId="0C509EE4" w16cex:dateUtc="2025-11-26T09:39:00Z"/>
 </w16cex:commentsExtensible>
 </file>
@@ -14162,7 +14128,6 @@
 <w16cid:commentsIds xmlns:wpc="http://schemas.microsoft.com/office/word/2010/wordprocessingCanvas" xmlns:cx="http://schemas.microsoft.com/office/drawing/2014/chartex" xmlns:cx1="http://schemas.microsoft.com/office/drawing/2015/9/8/chartex" xmlns:cx2="http://schemas.microsoft.com/office/drawing/2015/10/21/chartex" xmlns:cx3="http://schemas.microsoft.com/office/drawing/2016/5/9/chartex" xmlns:cx4="http://schemas.microsoft.com/office/drawing/2016/5/10/chartex" xmlns:cx5="http://schemas.microsoft.com/office/drawing/2016/5/11/chartex" xmlns:cx6="http://schemas.microsoft.com/office/drawing/2016/5/12/chartex" xmlns:cx7="http://schemas.microsoft.com/office/drawing/2016/5/13/chartex" xmlns:cx8="http://schemas.microsoft.com/office/drawing/2016/5/14/chartex" xmlns:mc="http://schemas.openxmlformats.org/markup-compatibility/2006" xmlns:aink="http://schemas.microsoft.com/office/drawing/2016/ink" xmlns:am3d="http://schemas.microsoft.com/office/drawing/2017/model3d" xmlns:o="urn:schemas-microsoft-com:office:office" xmlns:oel="http://schemas.microsoft.com/office/2019/extlst" xmlns:r="http://schemas.openxmlformats.org/officeDocument/2006/relationships" xmlns:m="http://schemas.openxmlformats.org/officeDocument/2006/math" xmlns:v="urn:schemas-microsoft-com:vml" xmlns:wp14="http://schemas.microsoft.com/office/word/2010/wordprocessingDrawing" xmlns:wp="http://schemas.openxmlformats.org/drawingml/2006/wordprocessingDrawing" xmlns:w10="urn:schemas-microsoft-com:office:word" xmlns:w="http://schemas.openxmlformats.org/wordprocessingml/2006/main" xmlns:w14="http://schemas.microsoft.com/office/word/2010/wordml" xmlns:w15="http://schemas.microsoft.com/office/word/2012/wordml" xmlns:w16cex="http://schemas.microsoft.com/office/word/2018/wordml/cex" xmlns:w16cid="http://schemas.microsoft.com/office/word/2016/wordml/cid" xmlns:w16="http://schemas.microsoft.com/office/word/2018/wordml" xmlns:w16du="http://schemas.microsoft.com/office/word/2023/wordml/word16du" xmlns:w16sdtdh="http://schemas.microsoft.com/office/word/2020/wordml/sdtdatahash" xmlns:w16sdtfl="http://schemas.microsoft.com/office/word/2024/wordml/sdtformatlock" xmlns:w16se="http://schemas.microsoft.com/office/word/2015/wordml/symex" xmlns:wpg="http://schemas.microsoft.com/office/word/2010/wordprocessingGroup" xmlns:wpi="http://schemas.microsoft.com/office/word/2010/wordprocessingInk" xmlns:wne="http://schemas.microsoft.com/office/word/2006/wordml" xmlns:wps="http://schemas.microsoft.com/office/word/2010/wordprocessingShape" mc:Ignorable="w14 w15 w16se w16cid w16 w16cex w16sdtdh w16sdtfl w16du wp14">
   <w16cid:commentId w16cid:paraId="7A375AD7" w16cid:durableId="0C976B4B"/>
   <w16cid:commentId w16cid:paraId="302ABAD3" w16cid:durableId="33B89A46"/>
-  <w16cid:commentId w16cid:paraId="759A5C47" w16cid:durableId="7DFD975E"/>
   <w16cid:commentId w16cid:paraId="30569D99" w16cid:durableId="0C509EE4"/>
 </w16cid:commentsIds>
 </file>

</xml_diff>

<commit_message>
working through simon edits
</commit_message>
<xml_diff>
--- a/docs/01_manuscript1/01_manu/manu-v7.docx
+++ b/docs/01_manuscript1/01_manu/manu-v7.docx
@@ -484,16 +484,16 @@
         <w:spacing w:line="360" w:lineRule="auto"/>
       </w:pPr>
       <w:r>
-        <w:t>[</w:t>
-      </w:r>
-      <w:r>
-        <w:rPr>
-          <w:lang w:val="en-US"/>
-        </w:rPr>
-        <w:t xml:space="preserve">This research was funded by the European Union’s Horizon 2020 research and innovation program under grant agreement No. 727321 (project acronym, IWMPRAISE); we thank the funding body for its financial support. </w:t>
-      </w:r>
-      <w:r>
-        <w:t>]</w:t>
+        <w:rPr>
+          <w:lang w:val="en-US"/>
+        </w:rPr>
+        <w:t>This research was funded by the European Union’s Horizon 2020 research and innovation program under grant agreement No. 727321 (project acronym, IWMPRAISE); we thank the funding body for its financial support</w:t>
+      </w:r>
+      <w:r>
+        <w:rPr>
+          <w:lang w:val="en-US"/>
+        </w:rPr>
+        <w:t>.</w:t>
       </w:r>
     </w:p>
     <w:p>
@@ -3433,13 +3433,7 @@
         <w:rPr>
           <w:lang w:val="en-US"/>
         </w:rPr>
-        <w:t>S</w:t>
-      </w:r>
-      <w:r>
-        <w:rPr>
-          <w:lang w:val="en-US"/>
-        </w:rPr>
-        <w:t>ub-subplot</w:t>
+        <w:t>Micro-plot</w:t>
       </w:r>
       <w:r>
         <w:rPr>
@@ -3792,7 +3786,55 @@
         <w:rPr>
           <w:lang w:val="en-US"/>
         </w:rPr>
-        <w:t xml:space="preserve"> (more details below). Tillage subplots were 5 meters wide and 40 m long. Each tillage subplot was divided into two columns with three sub-subplots arranged within each column for a total of six sub-subplots that were 2.5 m wide and 12.5 m long (see supplementary material for a visual aid). One of the six sub-subplots was reserved for other sampling efforts, and a cover crop system treatment (five levels) was applied randomly to the remaining five sub-subplots. In summary, this experiment included all combinations of two straw-managements, three primary tillage systems, and five cover crop systems for a total of 30 treatments</w:t>
+        <w:t xml:space="preserve"> (more details below). Tillage subplots were 5 meters wide and 40 m long. Each tillage subplot was divided into two columns with three </w:t>
+      </w:r>
+      <w:r>
+        <w:rPr>
+          <w:lang w:val="en-US"/>
+        </w:rPr>
+        <w:t>micro-</w:t>
+      </w:r>
+      <w:r>
+        <w:rPr>
+          <w:lang w:val="en-US"/>
+        </w:rPr>
+        <w:t xml:space="preserve">plots arranged within each column for a total of six </w:t>
+      </w:r>
+      <w:r>
+        <w:rPr>
+          <w:lang w:val="en-US"/>
+        </w:rPr>
+        <w:t>micro-</w:t>
+      </w:r>
+      <w:r>
+        <w:rPr>
+          <w:lang w:val="en-US"/>
+        </w:rPr>
+        <w:t xml:space="preserve">plots that were 2.5 m wide and 12.5 m long (see supplementary material for a visual aid). One of the six </w:t>
+      </w:r>
+      <w:r>
+        <w:rPr>
+          <w:lang w:val="en-US"/>
+        </w:rPr>
+        <w:t xml:space="preserve">micro </w:t>
+      </w:r>
+      <w:r>
+        <w:rPr>
+          <w:lang w:val="en-US"/>
+        </w:rPr>
+        <w:t xml:space="preserve">plots was reserved for other sampling efforts, and a cover crop system treatment (five levels) was applied randomly to the remaining five </w:t>
+      </w:r>
+      <w:r>
+        <w:rPr>
+          <w:lang w:val="en-US"/>
+        </w:rPr>
+        <w:t>micro-</w:t>
+      </w:r>
+      <w:r>
+        <w:rPr>
+          <w:lang w:val="en-US"/>
+        </w:rPr>
+        <w:t>plots. In summary, this experiment included all combinations of two straw-managements, three primary tillage systems, and five cover crop systems for a total of 30 treatments</w:t>
       </w:r>
       <w:r>
         <w:rPr>
@@ -3858,7 +3900,43 @@
         <w:rPr>
           <w:lang w:val="en-US"/>
         </w:rPr>
-        <w:t>The same straw managements and categorical tillage system treatments (no tillage, surface</w:t>
+        <w:t xml:space="preserve">The same straw managements and categorical tillage system treatments </w:t>
+      </w:r>
+      <w:r>
+        <w:rPr>
+          <w:lang w:val="en-US"/>
+        </w:rPr>
+        <w:t>[</w:t>
+      </w:r>
+      <w:r>
+        <w:rPr>
+          <w:lang w:val="en-US"/>
+        </w:rPr>
+        <w:t>no tillage</w:t>
+      </w:r>
+      <w:r>
+        <w:rPr>
+          <w:lang w:val="en-US"/>
+        </w:rPr>
+        <w:t xml:space="preserve"> (</w:t>
+      </w:r>
+      <w:r>
+        <w:rPr>
+          <w:lang w:val="en-US"/>
+        </w:rPr>
+        <w:t>NT</w:t>
+      </w:r>
+      <w:r>
+        <w:rPr>
+          <w:lang w:val="en-US"/>
+        </w:rPr>
+        <w:t>)</w:t>
+      </w:r>
+      <w:r>
+        <w:rPr>
+          <w:lang w:val="en-US"/>
+        </w:rPr>
+        <w:t>, surface</w:t>
       </w:r>
       <w:r>
         <w:rPr>
@@ -3870,7 +3948,49 @@
         <w:rPr>
           <w:lang w:val="en-US"/>
         </w:rPr>
-        <w:t>, inversion) have been in the same subplots since 2002. In the straw-removal treatments, following harvest of a small grain the residue (e.g., straw) was removed using a</w:t>
+        <w:t xml:space="preserve"> (S</w:t>
+      </w:r>
+      <w:r>
+        <w:rPr>
+          <w:lang w:val="en-US"/>
+        </w:rPr>
+        <w:t>URF</w:t>
+      </w:r>
+      <w:r>
+        <w:rPr>
+          <w:lang w:val="en-US"/>
+        </w:rPr>
+        <w:t>)</w:t>
+      </w:r>
+      <w:r>
+        <w:rPr>
+          <w:lang w:val="en-US"/>
+        </w:rPr>
+        <w:t>, inversion</w:t>
+      </w:r>
+      <w:r>
+        <w:rPr>
+          <w:lang w:val="en-US"/>
+        </w:rPr>
+        <w:t xml:space="preserve"> (I</w:t>
+      </w:r>
+      <w:r>
+        <w:rPr>
+          <w:lang w:val="en-US"/>
+        </w:rPr>
+        <w:t>NV</w:t>
+      </w:r>
+      <w:r>
+        <w:rPr>
+          <w:lang w:val="en-US"/>
+        </w:rPr>
+        <w:t>)]</w:t>
+      </w:r>
+      <w:r>
+        <w:rPr>
+          <w:lang w:val="en-US"/>
+        </w:rPr>
+        <w:t xml:space="preserve"> have been in the same subplots since 2002. In the straw-removal treatments, following harvest of a small grain the residue (e.g., straw) was removed using a</w:t>
       </w:r>
       <w:r>
         <w:rPr>
@@ -3882,19 +4002,7 @@
         <w:rPr>
           <w:lang w:val="en-US"/>
         </w:rPr>
-        <w:t xml:space="preserve"> wherein the straw was removed from the plots using a weed harrow. </w:t>
-      </w:r>
-      <w:r>
-        <w:rPr>
-          <w:lang w:val="en-US"/>
-        </w:rPr>
-        <w:t xml:space="preserve">, </w:t>
-      </w:r>
-      <w:r>
-        <w:rPr>
-          <w:lang w:val="en-US"/>
-        </w:rPr>
-        <w:t xml:space="preserve">This </w:t>
+        <w:t xml:space="preserve"> wherein the straw was removed from the plots using a weed harrow. This </w:t>
       </w:r>
       <w:r>
         <w:rPr>
@@ -3981,7 +4089,25 @@
         <w:rPr>
           <w:lang w:val="en-US"/>
         </w:rPr>
-        <w:t xml:space="preserve">was allowed to remain in the field. The exact machinery and timing of operations for each categorical tillage treatment have varied since 2002 (Scherner et al., 2016; Hansen et al., 2010). In the present experiment (2018-2020), plots under the inversion tillage treatment were moldboard plowed to a depth of 20 cm in the </w:t>
+        <w:t xml:space="preserve">was allowed to remain in the field. The exact machinery and timing of operations for each categorical tillage treatment have varied since 2002 (Scherner et al., 2016; Hansen et al., 2010). In the present experiment (2018-2020), plots under the </w:t>
+      </w:r>
+      <w:r>
+        <w:rPr>
+          <w:lang w:val="en-US"/>
+        </w:rPr>
+        <w:t>I</w:t>
+      </w:r>
+      <w:r>
+        <w:rPr>
+          <w:lang w:val="en-US"/>
+        </w:rPr>
+        <w:t>NV</w:t>
+      </w:r>
+      <w:r>
+        <w:rPr>
+          <w:lang w:val="en-US"/>
+        </w:rPr>
+        <w:t xml:space="preserve"> treatment were moldboard plowed to a depth of 20 cm in the </w:t>
       </w:r>
       <w:r>
         <w:rPr>
@@ -4026,7 +4152,31 @@
         <w:rPr>
           <w:lang w:val="en-US"/>
         </w:rPr>
-        <w:t xml:space="preserve">For the surface tillage system (non-inversion), a </w:t>
+        <w:t xml:space="preserve">For the </w:t>
+      </w:r>
+      <w:r>
+        <w:rPr>
+          <w:lang w:val="en-US"/>
+        </w:rPr>
+        <w:t>SURF</w:t>
+      </w:r>
+      <w:r>
+        <w:rPr>
+          <w:lang w:val="en-US"/>
+        </w:rPr>
+        <w:t xml:space="preserve"> system (non-inversion</w:t>
+      </w:r>
+      <w:r>
+        <w:rPr>
+          <w:lang w:val="en-US"/>
+        </w:rPr>
+        <w:t xml:space="preserve"> tillage</w:t>
+      </w:r>
+      <w:r>
+        <w:rPr>
+          <w:lang w:val="en-US"/>
+        </w:rPr>
+        <w:t xml:space="preserve">), a </w:t>
       </w:r>
       <w:r>
         <w:rPr>
@@ -4048,13 +4198,31 @@
         <w:t xml:space="preserve"> to a depth of 3-4 cm before planting the fodder radish cover crop after harvest (see Table 1)</w:t>
       </w:r>
       <w:r>
-        <w:t xml:space="preserve">. In both the no-till and surface tillage systems, crops were sown with a chisel coulter (Horsch Airseeder CO 3) with row spacings of 17.5 cm for </w:t>
+        <w:t xml:space="preserve">. In both the </w:t>
+      </w:r>
+      <w:r>
+        <w:t>NT</w:t>
+      </w:r>
+      <w:r>
+        <w:t xml:space="preserve"> and </w:t>
+      </w:r>
+      <w:r>
+        <w:t>SURF</w:t>
+      </w:r>
+      <w:r>
+        <w:t xml:space="preserve"> systems, crops were sown with a chisel coulter (Horsch Airseeder CO 3) with row spacings of 17.5 cm for </w:t>
       </w:r>
       <w:r>
         <w:t>all crops</w:t>
       </w:r>
       <w:r>
-        <w:t xml:space="preserve">. Row spacings were different for the inversion tillage system due to </w:t>
+        <w:t xml:space="preserve">. Row spacings were different for the </w:t>
+      </w:r>
+      <w:r>
+        <w:t xml:space="preserve">INV system </w:t>
+      </w:r>
+      <w:r>
+        <w:t xml:space="preserve">due to </w:t>
       </w:r>
       <w:r>
         <w:t xml:space="preserve">differences in the </w:t>
@@ -4125,28 +4293,137 @@
         <w:rPr>
           <w:lang w:val="en-US"/>
         </w:rPr>
-        <w:t xml:space="preserve">2018 growing season, five cover crop systems were randomly applied to the sub-subplots (Table 1). The same sub-subplot treatments were maintained for 2018, 2019 and were tracked until faba bean harvest in 2020. The sampling area for all measurements was located in the inner 1.5 m x 10 m area of the sub-subplots. </w:t>
-      </w:r>
-    </w:p>
-    <w:p>
-      <w:pPr>
-        <w:spacing w:line="360" w:lineRule="auto"/>
-        <w:rPr>
-          <w:lang w:val="en-US"/>
-        </w:rPr>
-      </w:pPr>
-    </w:p>
-    <w:p>
-      <w:pPr>
-        <w:spacing w:line="360" w:lineRule="auto"/>
-        <w:rPr>
-          <w:lang w:val="en-US"/>
-        </w:rPr>
-      </w:pPr>
-      <w:r>
-        <w:rPr>
-          <w:lang w:val="en-US"/>
-        </w:rPr>
+        <w:t xml:space="preserve">2018 growing season, five cover crop systems were randomly applied to the </w:t>
+      </w:r>
+      <w:r>
+        <w:rPr>
+          <w:lang w:val="en-US"/>
+        </w:rPr>
+        <w:t>micro-plot</w:t>
+      </w:r>
+      <w:r>
+        <w:rPr>
+          <w:lang w:val="en-US"/>
+        </w:rPr>
+        <w:t xml:space="preserve">s (Table 1). The same </w:t>
+      </w:r>
+      <w:r>
+        <w:rPr>
+          <w:lang w:val="en-US"/>
+        </w:rPr>
+        <w:t>micro-plot</w:t>
+      </w:r>
+      <w:r>
+        <w:rPr>
+          <w:lang w:val="en-US"/>
+        </w:rPr>
+        <w:t xml:space="preserve"> treatments were maintained for 2018, 2019 and were tracked until faba bean harvest in 2020. The sampling area for all measurements was located in the inner 1.5 m x 10 m area of the </w:t>
+      </w:r>
+      <w:r>
+        <w:rPr>
+          <w:lang w:val="en-US"/>
+        </w:rPr>
+        <w:t>micro-plot</w:t>
+      </w:r>
+      <w:r>
+        <w:rPr>
+          <w:lang w:val="en-US"/>
+        </w:rPr>
+        <w:t xml:space="preserve">s. </w:t>
+      </w:r>
+    </w:p>
+    <w:p>
+      <w:pPr>
+        <w:spacing w:line="360" w:lineRule="auto"/>
+        <w:rPr>
+          <w:lang w:val="en-US"/>
+        </w:rPr>
+      </w:pPr>
+    </w:p>
+    <w:p>
+      <w:pPr>
+        <w:spacing w:line="360" w:lineRule="auto"/>
+        <w:rPr>
+          <w:lang w:val="en-US"/>
+        </w:rPr>
+      </w:pPr>
+    </w:p>
+    <w:p>
+      <w:pPr>
+        <w:spacing w:line="360" w:lineRule="auto"/>
+        <w:rPr>
+          <w:lang w:val="en-US"/>
+        </w:rPr>
+      </w:pPr>
+    </w:p>
+    <w:p>
+      <w:pPr>
+        <w:spacing w:line="360" w:lineRule="auto"/>
+        <w:rPr>
+          <w:lang w:val="en-US"/>
+        </w:rPr>
+      </w:pPr>
+    </w:p>
+    <w:p>
+      <w:pPr>
+        <w:spacing w:line="360" w:lineRule="auto"/>
+        <w:rPr>
+          <w:lang w:val="en-US"/>
+        </w:rPr>
+      </w:pPr>
+    </w:p>
+    <w:p>
+      <w:pPr>
+        <w:spacing w:line="360" w:lineRule="auto"/>
+        <w:rPr>
+          <w:lang w:val="en-US"/>
+        </w:rPr>
+      </w:pPr>
+    </w:p>
+    <w:p>
+      <w:pPr>
+        <w:spacing w:line="360" w:lineRule="auto"/>
+        <w:rPr>
+          <w:lang w:val="en-US"/>
+        </w:rPr>
+      </w:pPr>
+    </w:p>
+    <w:p>
+      <w:pPr>
+        <w:spacing w:line="360" w:lineRule="auto"/>
+        <w:rPr>
+          <w:lang w:val="en-US"/>
+        </w:rPr>
+      </w:pPr>
+    </w:p>
+    <w:p>
+      <w:pPr>
+        <w:spacing w:line="360" w:lineRule="auto"/>
+        <w:rPr>
+          <w:lang w:val="en-US"/>
+        </w:rPr>
+      </w:pPr>
+    </w:p>
+    <w:p>
+      <w:pPr>
+        <w:spacing w:line="360" w:lineRule="auto"/>
+        <w:rPr>
+          <w:lang w:val="en-US"/>
+        </w:rPr>
+      </w:pPr>
+    </w:p>
+    <w:p>
+      <w:pPr>
+        <w:spacing w:line="360" w:lineRule="auto"/>
+        <w:rPr>
+          <w:lang w:val="en-US"/>
+        </w:rPr>
+      </w:pPr>
+      <w:r>
+        <w:rPr>
+          <w:lang w:val="en-US"/>
+        </w:rPr>
+        <w:lastRenderedPageBreak/>
         <w:t>Table 1. Summary of the five cover crop systems</w:t>
       </w:r>
     </w:p>
@@ -4166,11 +4443,14 @@
       </w:tblPr>
       <w:tblGrid>
         <w:gridCol w:w="1555"/>
-        <w:gridCol w:w="2126"/>
+        <w:gridCol w:w="3265"/>
+        <w:gridCol w:w="1984"/>
         <w:gridCol w:w="1843"/>
-        <w:gridCol w:w="2976"/>
       </w:tblGrid>
       <w:tr>
+        <w:trPr>
+          <w:cantSplit/>
+        </w:trPr>
         <w:tc>
           <w:tcPr>
             <w:tcW w:w="1555" w:type="dxa"/>
@@ -4209,7 +4489,35 @@
         </w:tc>
         <w:tc>
           <w:tcPr>
-            <w:tcW w:w="2126" w:type="dxa"/>
+            <w:tcW w:w="3265" w:type="dxa"/>
+            <w:tcBorders>
+              <w:top w:val="single" w:sz="4" w:space="0" w:color="auto"/>
+              <w:bottom w:val="single" w:sz="4" w:space="0" w:color="auto"/>
+            </w:tcBorders>
+            <w:vAlign w:val="center"/>
+          </w:tcPr>
+          <w:p>
+            <w:pPr>
+              <w:jc w:val="center"/>
+              <w:rPr>
+                <w:b/>
+                <w:bCs/>
+                <w:lang w:val="en-US"/>
+              </w:rPr>
+            </w:pPr>
+            <w:r>
+              <w:rPr>
+                <w:b/>
+                <w:bCs/>
+                <w:lang w:val="en-US"/>
+              </w:rPr>
+              <w:t>Seeding method and timing</w:t>
+            </w:r>
+          </w:p>
+        </w:tc>
+        <w:tc>
+          <w:tcPr>
+            <w:tcW w:w="1984" w:type="dxa"/>
             <w:tcBorders>
               <w:top w:val="single" w:sz="4" w:space="0" w:color="auto"/>
               <w:bottom w:val="single" w:sz="4" w:space="0" w:color="auto"/>
@@ -4263,36 +4571,11 @@
             </w:r>
           </w:p>
         </w:tc>
-        <w:tc>
-          <w:tcPr>
-            <w:tcW w:w="2976" w:type="dxa"/>
-            <w:tcBorders>
-              <w:top w:val="single" w:sz="4" w:space="0" w:color="auto"/>
-              <w:bottom w:val="single" w:sz="4" w:space="0" w:color="auto"/>
-            </w:tcBorders>
-            <w:vAlign w:val="center"/>
-          </w:tcPr>
-          <w:p>
-            <w:pPr>
-              <w:jc w:val="center"/>
-              <w:rPr>
-                <w:b/>
-                <w:bCs/>
-                <w:lang w:val="en-US"/>
-              </w:rPr>
-            </w:pPr>
-            <w:r>
-              <w:rPr>
-                <w:b/>
-                <w:bCs/>
-                <w:lang w:val="en-US"/>
-              </w:rPr>
-              <w:t>Seeding method and timing</w:t>
-            </w:r>
-          </w:p>
-        </w:tc>
       </w:tr>
       <w:tr>
+        <w:trPr>
+          <w:cantSplit/>
+        </w:trPr>
         <w:tc>
           <w:tcPr>
             <w:tcW w:w="1555" w:type="dxa"/>
@@ -4304,7 +4587,6 @@
           </w:tcPr>
           <w:p>
             <w:pPr>
-              <w:spacing w:line="360" w:lineRule="auto"/>
               <w:jc w:val="center"/>
               <w:rPr>
                 <w:lang w:val="en-US"/>
@@ -4320,7 +4602,72 @@
         </w:tc>
         <w:tc>
           <w:tcPr>
-            <w:tcW w:w="2126" w:type="dxa"/>
+            <w:tcW w:w="3265" w:type="dxa"/>
+            <w:tcBorders>
+              <w:top w:val="single" w:sz="4" w:space="0" w:color="auto"/>
+              <w:bottom w:val="single" w:sz="4" w:space="0" w:color="auto"/>
+            </w:tcBorders>
+            <w:vAlign w:val="center"/>
+          </w:tcPr>
+          <w:p>
+            <w:pPr>
+              <w:jc w:val="center"/>
+              <w:rPr>
+                <w:lang w:val="en-US"/>
+              </w:rPr>
+            </w:pPr>
+            <w:r>
+              <w:rPr>
+                <w:lang w:val="en-US"/>
+              </w:rPr>
+              <w:t xml:space="preserve">Sown 1 cm deep in between cash crop rows </w:t>
+            </w:r>
+            <w:r>
+              <w:rPr>
+                <w:lang w:val="en-US"/>
+              </w:rPr>
+              <w:t>(</w:t>
+            </w:r>
+            <w:commentRangeStart w:id="3"/>
+            <w:r>
+              <w:rPr>
+                <w:lang w:val="en-US"/>
+              </w:rPr>
+              <w:t>12.5 cm</w:t>
+            </w:r>
+            <w:r>
+              <w:rPr>
+                <w:lang w:val="en-US"/>
+              </w:rPr>
+              <w:t xml:space="preserve"> or 17.5 cm, see section 2.1.2</w:t>
+            </w:r>
+            <w:commentRangeEnd w:id="3"/>
+            <w:r>
+              <w:rPr>
+                <w:rStyle w:val="CommentReference"/>
+                <w:sz w:val="24"/>
+                <w:szCs w:val="24"/>
+                <w:lang w:val="en-US"/>
+              </w:rPr>
+              <w:commentReference w:id="3"/>
+            </w:r>
+            <w:r>
+              <w:rPr>
+                <w:lang w:val="en-US"/>
+              </w:rPr>
+              <w:t>)</w:t>
+            </w:r>
+            <w:r>
+              <w:rPr>
+                <w:lang w:val="en-US"/>
+              </w:rPr>
+              <w:t xml:space="preserve"> shortly after cash crop planting</w:t>
+            </w:r>
+          </w:p>
+        </w:tc>
+        <w:tc>
+          <w:tcPr>
+            <w:tcW w:w="1984" w:type="dxa"/>
             <w:vMerge w:val="restart"/>
             <w:tcBorders>
               <w:top w:val="single" w:sz="4" w:space="0" w:color="auto"/>
@@ -4329,7 +4676,6 @@
           </w:tcPr>
           <w:p>
             <w:pPr>
-              <w:spacing w:line="360" w:lineRule="auto"/>
               <w:jc w:val="center"/>
               <w:rPr>
                 <w:lang w:val="en-US"/>
@@ -4376,7 +4722,6 @@
           </w:tcPr>
           <w:p>
             <w:pPr>
-              <w:spacing w:line="360" w:lineRule="auto"/>
               <w:jc w:val="center"/>
               <w:rPr>
                 <w:lang w:val="en-US"/>
@@ -4413,83 +4758,14 @@
                 <w:lang w:val="en-US"/>
               </w:rPr>
               <w:t xml:space="preserve"> clover</w:t>
-            </w:r>
-          </w:p>
-        </w:tc>
-        <w:tc>
-          <w:tcPr>
-            <w:tcW w:w="2976" w:type="dxa"/>
-            <w:tcBorders>
-              <w:top w:val="single" w:sz="4" w:space="0" w:color="auto"/>
-              <w:bottom w:val="single" w:sz="4" w:space="0" w:color="auto"/>
-            </w:tcBorders>
-            <w:vAlign w:val="center"/>
-          </w:tcPr>
-          <w:p>
-            <w:pPr>
-              <w:spacing w:line="360" w:lineRule="auto"/>
-              <w:jc w:val="center"/>
-              <w:rPr>
-                <w:lang w:val="en-US"/>
-              </w:rPr>
-            </w:pPr>
-            <w:r>
-              <w:rPr>
-                <w:lang w:val="en-US"/>
-              </w:rPr>
-              <w:t xml:space="preserve">Sown 1 cm deep in between cash crop rows </w:t>
-            </w:r>
-            <w:r>
-              <w:rPr>
-                <w:lang w:val="en-US"/>
-              </w:rPr>
-              <w:t>(</w:t>
-            </w:r>
-            <w:commentRangeStart w:id="3"/>
-            <w:r>
-              <w:rPr>
-                <w:lang w:val="en-US"/>
-              </w:rPr>
-              <w:t>12.5 cm</w:t>
-            </w:r>
-            <w:r>
-              <w:rPr>
-                <w:lang w:val="en-US"/>
-              </w:rPr>
-              <w:t xml:space="preserve"> or 17.5 cm, see section 2.1.2</w:t>
-            </w:r>
-            <w:commentRangeEnd w:id="3"/>
-            <w:r>
-              <w:rPr>
-                <w:rStyle w:val="CommentReference"/>
-                <w:sz w:val="24"/>
-                <w:szCs w:val="24"/>
-                <w:lang w:val="en-US"/>
-              </w:rPr>
-              <w:commentReference w:id="3"/>
-            </w:r>
-            <w:r>
-              <w:rPr>
-                <w:lang w:val="en-US"/>
-              </w:rPr>
-              <w:t>)</w:t>
-            </w:r>
-            <w:r>
-              <w:rPr>
-                <w:lang w:val="en-US"/>
-              </w:rPr>
-              <w:t xml:space="preserve"> </w:t>
-            </w:r>
-            <w:r>
-              <w:rPr>
-                <w:lang w:val="en-US"/>
-              </w:rPr>
-              <w:t>shortly after cash crop planting</w:t>
             </w:r>
           </w:p>
         </w:tc>
       </w:tr>
       <w:tr>
+        <w:trPr>
+          <w:cantSplit/>
+        </w:trPr>
         <w:tc>
           <w:tcPr>
             <w:tcW w:w="1555" w:type="dxa"/>
@@ -4501,7 +4777,6 @@
           </w:tcPr>
           <w:p>
             <w:pPr>
-              <w:spacing w:line="360" w:lineRule="auto"/>
               <w:jc w:val="center"/>
               <w:rPr>
                 <w:lang w:val="en-US"/>
@@ -4511,14 +4786,37 @@
               <w:rPr>
                 <w:lang w:val="en-US"/>
               </w:rPr>
-              <w:lastRenderedPageBreak/>
               <w:t>MixM</w:t>
             </w:r>
           </w:p>
         </w:tc>
         <w:tc>
           <w:tcPr>
-            <w:tcW w:w="2126" w:type="dxa"/>
+            <w:tcW w:w="3265" w:type="dxa"/>
+            <w:tcBorders>
+              <w:top w:val="single" w:sz="4" w:space="0" w:color="auto"/>
+              <w:bottom w:val="single" w:sz="4" w:space="0" w:color="auto"/>
+            </w:tcBorders>
+            <w:vAlign w:val="center"/>
+          </w:tcPr>
+          <w:p>
+            <w:pPr>
+              <w:jc w:val="center"/>
+              <w:rPr>
+                <w:lang w:val="en-US"/>
+              </w:rPr>
+            </w:pPr>
+            <w:r>
+              <w:rPr>
+                <w:lang w:val="en-US"/>
+              </w:rPr>
+              <w:t>Broadcast into standing crop approximately 14 days before expected cash crop harvest</w:t>
+            </w:r>
+          </w:p>
+        </w:tc>
+        <w:tc>
+          <w:tcPr>
+            <w:tcW w:w="1984" w:type="dxa"/>
             <w:vMerge/>
             <w:tcBorders>
               <w:bottom w:val="single" w:sz="4" w:space="0" w:color="auto"/>
@@ -4527,7 +4825,6 @@
           </w:tcPr>
           <w:p>
             <w:pPr>
-              <w:spacing w:line="360" w:lineRule="auto"/>
               <w:jc w:val="center"/>
               <w:rPr>
                 <w:lang w:val="en-US"/>
@@ -4546,41 +4843,18 @@
           </w:tcPr>
           <w:p>
             <w:pPr>
-              <w:spacing w:line="360" w:lineRule="auto"/>
               <w:jc w:val="center"/>
               <w:rPr>
                 <w:lang w:val="en-US"/>
               </w:rPr>
             </w:pPr>
-          </w:p>
-        </w:tc>
-        <w:tc>
-          <w:tcPr>
-            <w:tcW w:w="2976" w:type="dxa"/>
-            <w:tcBorders>
-              <w:top w:val="single" w:sz="4" w:space="0" w:color="auto"/>
-              <w:bottom w:val="single" w:sz="4" w:space="0" w:color="auto"/>
-            </w:tcBorders>
-            <w:vAlign w:val="center"/>
-          </w:tcPr>
-          <w:p>
-            <w:pPr>
-              <w:spacing w:line="360" w:lineRule="auto"/>
-              <w:jc w:val="center"/>
-              <w:rPr>
-                <w:lang w:val="en-US"/>
-              </w:rPr>
-            </w:pPr>
-            <w:r>
-              <w:rPr>
-                <w:lang w:val="en-US"/>
-              </w:rPr>
-              <w:t>Broadcast into standing crop approximately 14 days before expected cash crop harvest</w:t>
-            </w:r>
           </w:p>
         </w:tc>
       </w:tr>
       <w:tr>
+        <w:trPr>
+          <w:cantSplit/>
+        </w:trPr>
         <w:tc>
           <w:tcPr>
             <w:tcW w:w="1555" w:type="dxa"/>
@@ -4592,7 +4866,6 @@
           </w:tcPr>
           <w:p>
             <w:pPr>
-              <w:spacing w:line="360" w:lineRule="auto"/>
               <w:jc w:val="center"/>
               <w:rPr>
                 <w:lang w:val="en-US"/>
@@ -4608,7 +4881,31 @@
         </w:tc>
         <w:tc>
           <w:tcPr>
-            <w:tcW w:w="2126" w:type="dxa"/>
+            <w:tcW w:w="3265" w:type="dxa"/>
+            <w:tcBorders>
+              <w:top w:val="single" w:sz="4" w:space="0" w:color="auto"/>
+              <w:bottom w:val="single" w:sz="4" w:space="0" w:color="auto"/>
+            </w:tcBorders>
+            <w:vAlign w:val="center"/>
+          </w:tcPr>
+          <w:p>
+            <w:pPr>
+              <w:jc w:val="center"/>
+              <w:rPr>
+                <w:lang w:val="en-US"/>
+              </w:rPr>
+            </w:pPr>
+            <w:r>
+              <w:rPr>
+                <w:lang w:val="en-US"/>
+              </w:rPr>
+              <w:t>Broadcast into standing crop approx. 14 days before expected crop harvest</w:t>
+            </w:r>
+          </w:p>
+        </w:tc>
+        <w:tc>
+          <w:tcPr>
+            <w:tcW w:w="1984" w:type="dxa"/>
             <w:vMerge w:val="restart"/>
             <w:tcBorders>
               <w:top w:val="single" w:sz="4" w:space="0" w:color="auto"/>
@@ -4617,7 +4914,6 @@
           </w:tcPr>
           <w:p>
             <w:pPr>
-              <w:spacing w:line="360" w:lineRule="auto"/>
               <w:jc w:val="center"/>
               <w:rPr>
                 <w:lang w:val="en-US"/>
@@ -4650,7 +4946,6 @@
           </w:tcPr>
           <w:p>
             <w:pPr>
-              <w:spacing w:line="360" w:lineRule="auto"/>
               <w:jc w:val="center"/>
               <w:rPr>
                 <w:lang w:val="en-US"/>
@@ -4668,36 +4963,14 @@
                 <w:lang w:val="en-US"/>
               </w:rPr>
               <w:t>-1</w:t>
-            </w:r>
-          </w:p>
-        </w:tc>
-        <w:tc>
-          <w:tcPr>
-            <w:tcW w:w="2976" w:type="dxa"/>
-            <w:tcBorders>
-              <w:top w:val="single" w:sz="4" w:space="0" w:color="auto"/>
-              <w:bottom w:val="single" w:sz="4" w:space="0" w:color="auto"/>
-            </w:tcBorders>
-            <w:vAlign w:val="center"/>
-          </w:tcPr>
-          <w:p>
-            <w:pPr>
-              <w:spacing w:line="360" w:lineRule="auto"/>
-              <w:jc w:val="center"/>
-              <w:rPr>
-                <w:lang w:val="en-US"/>
-              </w:rPr>
-            </w:pPr>
-            <w:r>
-              <w:rPr>
-                <w:lang w:val="en-US"/>
-              </w:rPr>
-              <w:t>Broadcast into standing crop approx. 14 days before expected crop harvest</w:t>
             </w:r>
           </w:p>
         </w:tc>
       </w:tr>
       <w:tr>
+        <w:trPr>
+          <w:cantSplit/>
+        </w:trPr>
         <w:tc>
           <w:tcPr>
             <w:tcW w:w="1555" w:type="dxa"/>
@@ -4709,7 +4982,6 @@
           </w:tcPr>
           <w:p>
             <w:pPr>
-              <w:spacing w:line="360" w:lineRule="auto"/>
               <w:jc w:val="center"/>
               <w:rPr>
                 <w:lang w:val="en-US"/>
@@ -4725,7 +4997,31 @@
         </w:tc>
         <w:tc>
           <w:tcPr>
-            <w:tcW w:w="2126" w:type="dxa"/>
+            <w:tcW w:w="3265" w:type="dxa"/>
+            <w:tcBorders>
+              <w:top w:val="single" w:sz="4" w:space="0" w:color="auto"/>
+              <w:bottom w:val="single" w:sz="4" w:space="0" w:color="auto"/>
+            </w:tcBorders>
+            <w:vAlign w:val="center"/>
+          </w:tcPr>
+          <w:p>
+            <w:pPr>
+              <w:jc w:val="center"/>
+              <w:rPr>
+                <w:lang w:val="en-US"/>
+              </w:rPr>
+            </w:pPr>
+            <w:r>
+              <w:rPr>
+                <w:lang w:val="en-US"/>
+              </w:rPr>
+              <w:t>Broadcast into the crop stubble post crop harvest</w:t>
+            </w:r>
+          </w:p>
+        </w:tc>
+        <w:tc>
+          <w:tcPr>
+            <w:tcW w:w="1984" w:type="dxa"/>
             <w:vMerge/>
             <w:tcBorders>
               <w:bottom w:val="single" w:sz="4" w:space="0" w:color="auto"/>
@@ -4734,7 +5030,6 @@
           </w:tcPr>
           <w:p>
             <w:pPr>
-              <w:spacing w:line="360" w:lineRule="auto"/>
               <w:jc w:val="center"/>
               <w:rPr>
                 <w:lang w:val="en-US"/>
@@ -4753,41 +5048,18 @@
           </w:tcPr>
           <w:p>
             <w:pPr>
-              <w:spacing w:line="360" w:lineRule="auto"/>
               <w:jc w:val="center"/>
               <w:rPr>
                 <w:lang w:val="en-US"/>
               </w:rPr>
             </w:pPr>
-          </w:p>
-        </w:tc>
-        <w:tc>
-          <w:tcPr>
-            <w:tcW w:w="2976" w:type="dxa"/>
-            <w:tcBorders>
-              <w:top w:val="single" w:sz="4" w:space="0" w:color="auto"/>
-              <w:bottom w:val="single" w:sz="4" w:space="0" w:color="auto"/>
-            </w:tcBorders>
-            <w:vAlign w:val="center"/>
-          </w:tcPr>
-          <w:p>
-            <w:pPr>
-              <w:spacing w:line="360" w:lineRule="auto"/>
-              <w:jc w:val="center"/>
-              <w:rPr>
-                <w:lang w:val="en-US"/>
-              </w:rPr>
-            </w:pPr>
-            <w:r>
-              <w:rPr>
-                <w:lang w:val="en-US"/>
-              </w:rPr>
-              <w:t>Broadcast into the crop stubble post crop harvest</w:t>
-            </w:r>
           </w:p>
         </w:tc>
       </w:tr>
       <w:tr>
+        <w:trPr>
+          <w:cantSplit/>
+        </w:trPr>
         <w:tc>
           <w:tcPr>
             <w:tcW w:w="1555" w:type="dxa"/>
@@ -4799,7 +5071,6 @@
           </w:tcPr>
           <w:p>
             <w:pPr>
-              <w:spacing w:line="360" w:lineRule="auto"/>
               <w:jc w:val="center"/>
               <w:rPr>
                 <w:lang w:val="en-US"/>
@@ -4815,7 +5086,7 @@
         </w:tc>
         <w:tc>
           <w:tcPr>
-            <w:tcW w:w="2126" w:type="dxa"/>
+            <w:tcW w:w="3265" w:type="dxa"/>
             <w:tcBorders>
               <w:top w:val="single" w:sz="4" w:space="0" w:color="auto"/>
               <w:bottom w:val="single" w:sz="4" w:space="0" w:color="auto"/>
@@ -4824,7 +5095,30 @@
           </w:tcPr>
           <w:p>
             <w:pPr>
-              <w:spacing w:line="360" w:lineRule="auto"/>
+              <w:jc w:val="center"/>
+              <w:rPr>
+                <w:lang w:val="en-US"/>
+              </w:rPr>
+            </w:pPr>
+            <w:r>
+              <w:rPr>
+                <w:lang w:val="en-US"/>
+              </w:rPr>
+              <w:t>-</w:t>
+            </w:r>
+          </w:p>
+        </w:tc>
+        <w:tc>
+          <w:tcPr>
+            <w:tcW w:w="1984" w:type="dxa"/>
+            <w:tcBorders>
+              <w:top w:val="single" w:sz="4" w:space="0" w:color="auto"/>
+              <w:bottom w:val="single" w:sz="4" w:space="0" w:color="auto"/>
+            </w:tcBorders>
+            <w:vAlign w:val="center"/>
+          </w:tcPr>
+          <w:p>
+            <w:pPr>
               <w:jc w:val="center"/>
               <w:rPr>
                 <w:lang w:val="en-US"/>
@@ -4849,32 +5143,6 @@
           </w:tcPr>
           <w:p>
             <w:pPr>
-              <w:spacing w:line="360" w:lineRule="auto"/>
-              <w:jc w:val="center"/>
-              <w:rPr>
-                <w:lang w:val="en-US"/>
-              </w:rPr>
-            </w:pPr>
-            <w:r>
-              <w:rPr>
-                <w:lang w:val="en-US"/>
-              </w:rPr>
-              <w:t>-</w:t>
-            </w:r>
-          </w:p>
-        </w:tc>
-        <w:tc>
-          <w:tcPr>
-            <w:tcW w:w="2976" w:type="dxa"/>
-            <w:tcBorders>
-              <w:top w:val="single" w:sz="4" w:space="0" w:color="auto"/>
-              <w:bottom w:val="single" w:sz="4" w:space="0" w:color="auto"/>
-            </w:tcBorders>
-            <w:vAlign w:val="center"/>
-          </w:tcPr>
-          <w:p>
-            <w:pPr>
-              <w:spacing w:line="360" w:lineRule="auto"/>
               <w:jc w:val="center"/>
               <w:rPr>
                 <w:lang w:val="en-US"/>
@@ -5028,7 +5296,13 @@
         <w:spacing w:line="360" w:lineRule="auto"/>
       </w:pPr>
       <w:r>
-        <w:t>Herbicide treatments reflected best practices and constraints imposed by both the tillage and cover crop system treatments</w:t>
+        <w:t xml:space="preserve">Herbicide treatments reflected best practices </w:t>
+      </w:r>
+      <w:r>
+        <w:t xml:space="preserve">using early spring visual surveys and a Danish online tool (XX), incorporating both </w:t>
+      </w:r>
+      <w:r>
+        <w:t>the tillage and cover crop system treatments</w:t>
       </w:r>
       <w:r>
         <w:t xml:space="preserve"> </w:t>
@@ -5170,7 +5444,6 @@
           </w:tcPr>
           <w:p>
             <w:pPr>
-              <w:spacing w:line="360" w:lineRule="auto"/>
               <w:jc w:val="center"/>
               <w:rPr>
                 <w:b/>
@@ -5201,7 +5474,6 @@
           </w:tcPr>
           <w:p>
             <w:pPr>
-              <w:spacing w:line="360" w:lineRule="auto"/>
               <w:jc w:val="center"/>
               <w:rPr>
                 <w:b/>
@@ -5233,7 +5505,6 @@
           </w:tcPr>
           <w:p>
             <w:pPr>
-              <w:spacing w:line="360" w:lineRule="auto"/>
               <w:jc w:val="center"/>
               <w:rPr>
                 <w:b/>
@@ -5264,7 +5535,6 @@
           </w:tcPr>
           <w:p>
             <w:pPr>
-              <w:spacing w:line="360" w:lineRule="auto"/>
               <w:jc w:val="center"/>
               <w:rPr>
                 <w:b/>
@@ -5297,7 +5567,6 @@
           </w:tcPr>
           <w:p>
             <w:pPr>
-              <w:spacing w:line="360" w:lineRule="auto"/>
               <w:jc w:val="center"/>
               <w:rPr>
                 <w:i/>
@@ -5319,7 +5588,6 @@
           </w:tcPr>
           <w:p>
             <w:pPr>
-              <w:spacing w:line="360" w:lineRule="auto"/>
               <w:jc w:val="center"/>
               <w:rPr>
                 <w:i/>
@@ -5341,7 +5609,6 @@
           </w:tcPr>
           <w:p>
             <w:pPr>
-              <w:spacing w:line="360" w:lineRule="auto"/>
               <w:jc w:val="center"/>
               <w:rPr>
                 <w:i/>
@@ -5372,7 +5639,6 @@
           </w:tcPr>
           <w:p>
             <w:pPr>
-              <w:spacing w:line="360" w:lineRule="auto"/>
               <w:jc w:val="center"/>
               <w:rPr>
                 <w:i/>
@@ -5403,7 +5669,6 @@
           </w:tcPr>
           <w:p>
             <w:pPr>
-              <w:spacing w:line="360" w:lineRule="auto"/>
               <w:jc w:val="center"/>
               <w:rPr>
                 <w:i/>
@@ -5434,7 +5699,6 @@
           </w:tcPr>
           <w:p>
             <w:pPr>
-              <w:spacing w:line="360" w:lineRule="auto"/>
               <w:jc w:val="center"/>
               <w:rPr>
                 <w:i/>
@@ -5458,7 +5722,6 @@
           </w:tcPr>
           <w:p>
             <w:pPr>
-              <w:spacing w:line="360" w:lineRule="auto"/>
               <w:jc w:val="center"/>
               <w:rPr>
                 <w:sz w:val="22"/>
@@ -5485,7 +5748,6 @@
           </w:tcPr>
           <w:p>
             <w:pPr>
-              <w:spacing w:line="360" w:lineRule="auto"/>
               <w:jc w:val="center"/>
               <w:rPr>
                 <w:sz w:val="22"/>
@@ -5497,7 +5759,22 @@
                 <w:sz w:val="22"/>
                 <w:szCs w:val="22"/>
               </w:rPr>
-              <w:t>Before cash crop planting (xx)</w:t>
+              <w:t>Before cash crop planting (</w:t>
+            </w:r>
+            <w:r>
+              <w:rPr>
+                <w:sz w:val="22"/>
+                <w:szCs w:val="22"/>
+                <w:highlight w:val="yellow"/>
+              </w:rPr>
+              <w:t>xx</w:t>
+            </w:r>
+            <w:r>
+              <w:rPr>
+                <w:sz w:val="22"/>
+                <w:szCs w:val="22"/>
+              </w:rPr>
+              <w:t>)</w:t>
             </w:r>
           </w:p>
         </w:tc>
@@ -5512,7 +5789,6 @@
           </w:tcPr>
           <w:p>
             <w:pPr>
-              <w:spacing w:line="360" w:lineRule="auto"/>
               <w:jc w:val="center"/>
               <w:rPr>
                 <w:sz w:val="22"/>
@@ -5539,7 +5815,6 @@
           </w:tcPr>
           <w:p>
             <w:pPr>
-              <w:spacing w:line="360" w:lineRule="auto"/>
               <w:jc w:val="center"/>
               <w:rPr>
                 <w:sz w:val="22"/>
@@ -5566,7 +5841,6 @@
           </w:tcPr>
           <w:p>
             <w:pPr>
-              <w:spacing w:line="360" w:lineRule="auto"/>
               <w:jc w:val="center"/>
               <w:rPr>
                 <w:sz w:val="22"/>
@@ -5593,7 +5867,6 @@
           </w:tcPr>
           <w:p>
             <w:pPr>
-              <w:spacing w:line="360" w:lineRule="auto"/>
               <w:jc w:val="center"/>
               <w:rPr>
                 <w:sz w:val="22"/>
@@ -5619,7 +5892,6 @@
           </w:tcPr>
           <w:p>
             <w:pPr>
-              <w:spacing w:line="360" w:lineRule="auto"/>
               <w:jc w:val="center"/>
               <w:rPr>
                 <w:sz w:val="22"/>
@@ -5631,15 +5903,14 @@
         <w:tc>
           <w:tcPr>
             <w:tcW w:w="1753" w:type="dxa"/>
+            <w:vMerge w:val="restart"/>
             <w:tcBorders>
               <w:top w:val="single" w:sz="4" w:space="0" w:color="auto"/>
-              <w:bottom w:val="single" w:sz="4" w:space="0" w:color="auto"/>
             </w:tcBorders>
             <w:vAlign w:val="center"/>
           </w:tcPr>
           <w:p>
             <w:pPr>
-              <w:spacing w:line="360" w:lineRule="auto"/>
               <w:jc w:val="center"/>
               <w:rPr>
                 <w:sz w:val="22"/>
@@ -5666,7 +5937,6 @@
           </w:tcPr>
           <w:p>
             <w:pPr>
-              <w:spacing w:line="360" w:lineRule="auto"/>
               <w:jc w:val="center"/>
               <w:rPr>
                 <w:sz w:val="22"/>
@@ -5693,7 +5963,6 @@
           </w:tcPr>
           <w:p>
             <w:pPr>
-              <w:spacing w:line="360" w:lineRule="auto"/>
               <w:jc w:val="center"/>
               <w:rPr>
                 <w:sz w:val="22"/>
@@ -5720,7 +5989,6 @@
           </w:tcPr>
           <w:p>
             <w:pPr>
-              <w:spacing w:line="360" w:lineRule="auto"/>
               <w:jc w:val="center"/>
               <w:rPr>
                 <w:sz w:val="22"/>
@@ -5747,7 +6015,6 @@
           </w:tcPr>
           <w:p>
             <w:pPr>
-              <w:spacing w:line="360" w:lineRule="auto"/>
               <w:jc w:val="center"/>
               <w:rPr>
                 <w:sz w:val="22"/>
@@ -5773,7 +6040,6 @@
           </w:tcPr>
           <w:p>
             <w:pPr>
-              <w:spacing w:line="360" w:lineRule="auto"/>
               <w:jc w:val="center"/>
               <w:rPr>
                 <w:sz w:val="22"/>
@@ -5785,28 +6051,20 @@
         <w:tc>
           <w:tcPr>
             <w:tcW w:w="1753" w:type="dxa"/>
+            <w:vMerge/>
             <w:tcBorders>
-              <w:top w:val="single" w:sz="4" w:space="0" w:color="auto"/>
               <w:bottom w:val="single" w:sz="4" w:space="0" w:color="auto"/>
             </w:tcBorders>
             <w:vAlign w:val="center"/>
           </w:tcPr>
           <w:p>
             <w:pPr>
-              <w:spacing w:line="360" w:lineRule="auto"/>
               <w:jc w:val="center"/>
               <w:rPr>
                 <w:sz w:val="22"/>
                 <w:szCs w:val="22"/>
               </w:rPr>
             </w:pPr>
-            <w:r>
-              <w:rPr>
-                <w:sz w:val="22"/>
-                <w:szCs w:val="22"/>
-              </w:rPr>
-              <w:t>After emergence (16 May)</w:t>
-            </w:r>
           </w:p>
         </w:tc>
         <w:tc>
@@ -5820,7 +6078,6 @@
           </w:tcPr>
           <w:p>
             <w:pPr>
-              <w:spacing w:line="360" w:lineRule="auto"/>
               <w:jc w:val="center"/>
               <w:rPr>
                 <w:sz w:val="22"/>
@@ -5834,7 +6091,7 @@
                 <w:szCs w:val="22"/>
                 <w:lang w:val="en-US"/>
               </w:rPr>
-              <w:t>NoCC, MixM, RadM, RadL</w:t>
+              <w:t>All except MixE</w:t>
             </w:r>
           </w:p>
         </w:tc>
@@ -5849,7 +6106,6 @@
           </w:tcPr>
           <w:p>
             <w:pPr>
-              <w:spacing w:line="360" w:lineRule="auto"/>
               <w:jc w:val="center"/>
               <w:rPr>
                 <w:sz w:val="22"/>
@@ -5863,7 +6119,7 @@
                 <w:szCs w:val="22"/>
                 <w:lang w:val="en-US"/>
               </w:rPr>
-              <w:t>NoCC, MixM, RadM, RadL</w:t>
+              <w:t>All except MixE</w:t>
             </w:r>
           </w:p>
         </w:tc>
@@ -5878,7 +6134,6 @@
           </w:tcPr>
           <w:p>
             <w:pPr>
-              <w:spacing w:line="360" w:lineRule="auto"/>
               <w:jc w:val="center"/>
               <w:rPr>
                 <w:sz w:val="22"/>
@@ -5892,7 +6147,7 @@
                 <w:szCs w:val="22"/>
                 <w:lang w:val="en-US"/>
               </w:rPr>
-              <w:t>NoCC, MixM, RadM, RadL</w:t>
+              <w:t>All except MixE</w:t>
             </w:r>
           </w:p>
         </w:tc>
@@ -5907,7 +6162,6 @@
           </w:tcPr>
           <w:p>
             <w:pPr>
-              <w:spacing w:line="360" w:lineRule="auto"/>
               <w:jc w:val="center"/>
               <w:rPr>
                 <w:sz w:val="22"/>
@@ -5938,7 +6192,6 @@
           </w:tcPr>
           <w:p>
             <w:pPr>
-              <w:spacing w:line="360" w:lineRule="auto"/>
               <w:jc w:val="center"/>
               <w:rPr>
                 <w:sz w:val="22"/>
@@ -5958,7 +6211,6 @@
           </w:tcPr>
           <w:p>
             <w:pPr>
-              <w:spacing w:line="360" w:lineRule="auto"/>
               <w:jc w:val="center"/>
               <w:rPr>
                 <w:sz w:val="22"/>
@@ -5985,7 +6237,6 @@
           </w:tcPr>
           <w:p>
             <w:pPr>
-              <w:spacing w:line="360" w:lineRule="auto"/>
               <w:jc w:val="center"/>
               <w:rPr>
                 <w:sz w:val="22"/>
@@ -5998,7 +6249,7 @@
                 <w:szCs w:val="22"/>
                 <w:lang w:val="en-US"/>
               </w:rPr>
-              <w:t>NoCC, MixM, RadM, RadL</w:t>
+              <w:t>All except MixE</w:t>
             </w:r>
           </w:p>
         </w:tc>
@@ -6013,7 +6264,6 @@
           </w:tcPr>
           <w:p>
             <w:pPr>
-              <w:spacing w:line="360" w:lineRule="auto"/>
               <w:jc w:val="center"/>
               <w:rPr>
                 <w:sz w:val="22"/>
@@ -6026,7 +6276,7 @@
                 <w:szCs w:val="22"/>
                 <w:lang w:val="en-US"/>
               </w:rPr>
-              <w:t>NoCC, MixM, RadM, RadL</w:t>
+              <w:t>All except MixE</w:t>
             </w:r>
           </w:p>
         </w:tc>
@@ -6041,7 +6291,6 @@
           </w:tcPr>
           <w:p>
             <w:pPr>
-              <w:spacing w:line="360" w:lineRule="auto"/>
               <w:jc w:val="center"/>
               <w:rPr>
                 <w:sz w:val="22"/>
@@ -6054,7 +6303,7 @@
                 <w:szCs w:val="22"/>
                 <w:lang w:val="en-US"/>
               </w:rPr>
-              <w:t>NoCC, MixM, RadM, RadL</w:t>
+              <w:t>All except MixE</w:t>
             </w:r>
           </w:p>
         </w:tc>
@@ -6069,7 +6318,6 @@
           </w:tcPr>
           <w:p>
             <w:pPr>
-              <w:spacing w:line="360" w:lineRule="auto"/>
               <w:jc w:val="center"/>
               <w:rPr>
                 <w:sz w:val="22"/>
@@ -6098,7 +6346,6 @@
           </w:tcPr>
           <w:p>
             <w:pPr>
-              <w:spacing w:line="360" w:lineRule="auto"/>
               <w:jc w:val="center"/>
               <w:rPr>
                 <w:sz w:val="22"/>
@@ -6115,7 +6362,6 @@
           </w:p>
           <w:p>
             <w:pPr>
-              <w:spacing w:line="360" w:lineRule="auto"/>
               <w:jc w:val="center"/>
               <w:rPr>
                 <w:sz w:val="22"/>
@@ -6142,7 +6388,6 @@
           </w:tcPr>
           <w:p>
             <w:pPr>
-              <w:spacing w:line="360" w:lineRule="auto"/>
               <w:jc w:val="center"/>
               <w:rPr>
                 <w:sz w:val="22"/>
@@ -6154,7 +6399,22 @@
                 <w:sz w:val="22"/>
                 <w:szCs w:val="22"/>
               </w:rPr>
-              <w:t>Before cash crop planting (xx)</w:t>
+              <w:t>Before cash crop planting (</w:t>
+            </w:r>
+            <w:r>
+              <w:rPr>
+                <w:sz w:val="22"/>
+                <w:szCs w:val="22"/>
+                <w:highlight w:val="yellow"/>
+              </w:rPr>
+              <w:t>xx</w:t>
+            </w:r>
+            <w:r>
+              <w:rPr>
+                <w:sz w:val="22"/>
+                <w:szCs w:val="22"/>
+              </w:rPr>
+              <w:t>)</w:t>
             </w:r>
           </w:p>
         </w:tc>
@@ -6169,7 +6429,6 @@
           </w:tcPr>
           <w:p>
             <w:pPr>
-              <w:spacing w:line="360" w:lineRule="auto"/>
               <w:jc w:val="center"/>
               <w:rPr>
                 <w:sz w:val="22"/>
@@ -6196,7 +6455,6 @@
           </w:tcPr>
           <w:p>
             <w:pPr>
-              <w:spacing w:line="360" w:lineRule="auto"/>
               <w:jc w:val="center"/>
               <w:rPr>
                 <w:sz w:val="22"/>
@@ -6223,7 +6481,6 @@
           </w:tcPr>
           <w:p>
             <w:pPr>
-              <w:spacing w:line="360" w:lineRule="auto"/>
               <w:jc w:val="center"/>
               <w:rPr>
                 <w:sz w:val="22"/>
@@ -6250,7 +6507,6 @@
           </w:tcPr>
           <w:p>
             <w:pPr>
-              <w:spacing w:line="360" w:lineRule="auto"/>
               <w:jc w:val="center"/>
               <w:rPr>
                 <w:sz w:val="22"/>
@@ -6276,7 +6532,6 @@
           </w:tcPr>
           <w:p>
             <w:pPr>
-              <w:spacing w:line="360" w:lineRule="auto"/>
               <w:jc w:val="center"/>
               <w:rPr>
                 <w:sz w:val="22"/>
@@ -6288,15 +6543,14 @@
         <w:tc>
           <w:tcPr>
             <w:tcW w:w="1753" w:type="dxa"/>
+            <w:vMerge w:val="restart"/>
             <w:tcBorders>
               <w:top w:val="single" w:sz="4" w:space="0" w:color="auto"/>
-              <w:bottom w:val="single" w:sz="4" w:space="0" w:color="auto"/>
             </w:tcBorders>
             <w:vAlign w:val="center"/>
           </w:tcPr>
           <w:p>
             <w:pPr>
-              <w:spacing w:line="360" w:lineRule="auto"/>
               <w:jc w:val="center"/>
               <w:rPr>
                 <w:sz w:val="22"/>
@@ -6323,7 +6577,6 @@
           </w:tcPr>
           <w:p>
             <w:pPr>
-              <w:spacing w:line="360" w:lineRule="auto"/>
               <w:jc w:val="center"/>
               <w:rPr>
                 <w:sz w:val="22"/>
@@ -6350,7 +6603,6 @@
           </w:tcPr>
           <w:p>
             <w:pPr>
-              <w:spacing w:line="360" w:lineRule="auto"/>
               <w:jc w:val="center"/>
               <w:rPr>
                 <w:sz w:val="22"/>
@@ -6377,7 +6629,6 @@
           </w:tcPr>
           <w:p>
             <w:pPr>
-              <w:spacing w:line="360" w:lineRule="auto"/>
               <w:jc w:val="center"/>
               <w:rPr>
                 <w:sz w:val="22"/>
@@ -6404,7 +6655,6 @@
           </w:tcPr>
           <w:p>
             <w:pPr>
-              <w:spacing w:line="360" w:lineRule="auto"/>
               <w:jc w:val="center"/>
               <w:rPr>
                 <w:sz w:val="22"/>
@@ -6433,7 +6683,6 @@
           </w:tcPr>
           <w:p>
             <w:pPr>
-              <w:spacing w:line="360" w:lineRule="auto"/>
               <w:jc w:val="center"/>
               <w:rPr>
                 <w:sz w:val="22"/>
@@ -6445,28 +6694,20 @@
         <w:tc>
           <w:tcPr>
             <w:tcW w:w="1753" w:type="dxa"/>
+            <w:vMerge/>
             <w:tcBorders>
-              <w:top w:val="single" w:sz="4" w:space="0" w:color="auto"/>
               <w:bottom w:val="single" w:sz="4" w:space="0" w:color="auto"/>
             </w:tcBorders>
             <w:vAlign w:val="center"/>
           </w:tcPr>
           <w:p>
             <w:pPr>
-              <w:spacing w:line="360" w:lineRule="auto"/>
               <w:jc w:val="center"/>
               <w:rPr>
                 <w:sz w:val="22"/>
                 <w:szCs w:val="22"/>
               </w:rPr>
             </w:pPr>
-            <w:r>
-              <w:rPr>
-                <w:sz w:val="22"/>
-                <w:szCs w:val="22"/>
-              </w:rPr>
-              <w:t>After emergence (14 May)</w:t>
-            </w:r>
           </w:p>
         </w:tc>
         <w:tc>
@@ -6480,7 +6721,6 @@
           </w:tcPr>
           <w:p>
             <w:pPr>
-              <w:spacing w:line="360" w:lineRule="auto"/>
               <w:jc w:val="center"/>
               <w:rPr>
                 <w:sz w:val="22"/>
@@ -6493,7 +6733,7 @@
                 <w:szCs w:val="22"/>
                 <w:lang w:val="en-US"/>
               </w:rPr>
-              <w:t>NoCC, MixM, RadM, RadL</w:t>
+              <w:t>All except MixE</w:t>
             </w:r>
           </w:p>
         </w:tc>
@@ -6508,7 +6748,6 @@
           </w:tcPr>
           <w:p>
             <w:pPr>
-              <w:spacing w:line="360" w:lineRule="auto"/>
               <w:jc w:val="center"/>
               <w:rPr>
                 <w:sz w:val="22"/>
@@ -6521,7 +6760,7 @@
                 <w:szCs w:val="22"/>
                 <w:lang w:val="en-US"/>
               </w:rPr>
-              <w:t>NoCC, MixM, RadM, RadL</w:t>
+              <w:t>All except MixE</w:t>
             </w:r>
           </w:p>
         </w:tc>
@@ -6536,7 +6775,6 @@
           </w:tcPr>
           <w:p>
             <w:pPr>
-              <w:spacing w:line="360" w:lineRule="auto"/>
               <w:jc w:val="center"/>
               <w:rPr>
                 <w:sz w:val="22"/>
@@ -6549,7 +6787,7 @@
                 <w:szCs w:val="22"/>
                 <w:lang w:val="en-US"/>
               </w:rPr>
-              <w:t>NoCC, MixM, RadM, RadL</w:t>
+              <w:t>All except MixE</w:t>
             </w:r>
           </w:p>
         </w:tc>
@@ -6564,7 +6802,6 @@
           </w:tcPr>
           <w:p>
             <w:pPr>
-              <w:spacing w:line="360" w:lineRule="auto"/>
               <w:jc w:val="center"/>
               <w:rPr>
                 <w:sz w:val="22"/>
@@ -6593,7 +6830,6 @@
           </w:tcPr>
           <w:p>
             <w:pPr>
-              <w:spacing w:line="360" w:lineRule="auto"/>
               <w:jc w:val="center"/>
               <w:rPr>
                 <w:sz w:val="22"/>
@@ -6610,7 +6846,6 @@
           </w:p>
           <w:p>
             <w:pPr>
-              <w:spacing w:line="360" w:lineRule="auto"/>
               <w:jc w:val="center"/>
               <w:rPr>
                 <w:sz w:val="22"/>
@@ -6637,7 +6872,6 @@
           </w:tcPr>
           <w:p>
             <w:pPr>
-              <w:spacing w:line="360" w:lineRule="auto"/>
               <w:jc w:val="center"/>
               <w:rPr>
                 <w:sz w:val="22"/>
@@ -6664,7 +6898,6 @@
           </w:tcPr>
           <w:p>
             <w:pPr>
-              <w:spacing w:line="360" w:lineRule="auto"/>
               <w:jc w:val="center"/>
               <w:rPr>
                 <w:sz w:val="22"/>
@@ -6691,7 +6924,6 @@
           </w:tcPr>
           <w:p>
             <w:pPr>
-              <w:spacing w:line="360" w:lineRule="auto"/>
               <w:jc w:val="center"/>
               <w:rPr>
                 <w:sz w:val="22"/>
@@ -6718,7 +6950,6 @@
           </w:tcPr>
           <w:p>
             <w:pPr>
-              <w:spacing w:line="360" w:lineRule="auto"/>
               <w:jc w:val="center"/>
               <w:rPr>
                 <w:sz w:val="22"/>
@@ -6745,7 +6976,6 @@
           </w:tcPr>
           <w:p>
             <w:pPr>
-              <w:spacing w:line="360" w:lineRule="auto"/>
               <w:jc w:val="center"/>
               <w:rPr>
                 <w:sz w:val="22"/>
@@ -6771,7 +7001,6 @@
           </w:tcPr>
           <w:p>
             <w:pPr>
-              <w:spacing w:line="360" w:lineRule="auto"/>
               <w:jc w:val="center"/>
               <w:rPr>
                 <w:sz w:val="22"/>
@@ -6791,7 +7020,6 @@
           </w:tcPr>
           <w:p>
             <w:pPr>
-              <w:spacing w:line="360" w:lineRule="auto"/>
               <w:jc w:val="center"/>
               <w:rPr>
                 <w:sz w:val="22"/>
@@ -6818,7 +7046,6 @@
           </w:tcPr>
           <w:p>
             <w:pPr>
-              <w:spacing w:line="360" w:lineRule="auto"/>
               <w:jc w:val="center"/>
               <w:rPr>
                 <w:sz w:val="22"/>
@@ -6845,7 +7072,6 @@
           </w:tcPr>
           <w:p>
             <w:pPr>
-              <w:spacing w:line="360" w:lineRule="auto"/>
               <w:jc w:val="center"/>
               <w:rPr>
                 <w:sz w:val="22"/>
@@ -6872,7 +7098,6 @@
           </w:tcPr>
           <w:p>
             <w:pPr>
-              <w:spacing w:line="360" w:lineRule="auto"/>
               <w:jc w:val="center"/>
               <w:rPr>
                 <w:sz w:val="22"/>
@@ -6899,7 +7124,6 @@
           </w:tcPr>
           <w:p>
             <w:pPr>
-              <w:spacing w:line="360" w:lineRule="auto"/>
               <w:jc w:val="center"/>
               <w:rPr>
                 <w:sz w:val="22"/>
@@ -6925,7 +7149,6 @@
           </w:tcPr>
           <w:p>
             <w:pPr>
-              <w:spacing w:line="360" w:lineRule="auto"/>
               <w:jc w:val="center"/>
               <w:rPr>
                 <w:sz w:val="22"/>
@@ -6945,7 +7168,6 @@
           </w:tcPr>
           <w:p>
             <w:pPr>
-              <w:spacing w:line="360" w:lineRule="auto"/>
               <w:jc w:val="center"/>
               <w:rPr>
                 <w:sz w:val="22"/>
@@ -6972,7 +7194,6 @@
           </w:tcPr>
           <w:p>
             <w:pPr>
-              <w:spacing w:line="360" w:lineRule="auto"/>
               <w:jc w:val="center"/>
               <w:rPr>
                 <w:sz w:val="22"/>
@@ -6999,7 +7220,6 @@
           </w:tcPr>
           <w:p>
             <w:pPr>
-              <w:spacing w:line="360" w:lineRule="auto"/>
               <w:jc w:val="center"/>
               <w:rPr>
                 <w:sz w:val="22"/>
@@ -7026,7 +7246,6 @@
           </w:tcPr>
           <w:p>
             <w:pPr>
-              <w:spacing w:line="360" w:lineRule="auto"/>
               <w:jc w:val="center"/>
               <w:rPr>
                 <w:sz w:val="22"/>
@@ -7053,7 +7272,6 @@
           </w:tcPr>
           <w:p>
             <w:pPr>
-              <w:spacing w:line="360" w:lineRule="auto"/>
               <w:jc w:val="center"/>
               <w:rPr>
                 <w:sz w:val="22"/>
@@ -7082,7 +7300,6 @@
           </w:tcPr>
           <w:p>
             <w:pPr>
-              <w:spacing w:line="360" w:lineRule="auto"/>
               <w:jc w:val="center"/>
               <w:rPr>
                 <w:sz w:val="22"/>
@@ -7102,7 +7319,6 @@
           </w:tcPr>
           <w:p>
             <w:pPr>
-              <w:spacing w:line="360" w:lineRule="auto"/>
               <w:jc w:val="center"/>
               <w:rPr>
                 <w:sz w:val="22"/>
@@ -7129,7 +7345,6 @@
           </w:tcPr>
           <w:p>
             <w:pPr>
-              <w:spacing w:line="360" w:lineRule="auto"/>
               <w:jc w:val="center"/>
               <w:rPr>
                 <w:sz w:val="22"/>
@@ -7156,7 +7371,6 @@
           </w:tcPr>
           <w:p>
             <w:pPr>
-              <w:spacing w:line="360" w:lineRule="auto"/>
               <w:jc w:val="center"/>
               <w:rPr>
                 <w:sz w:val="22"/>
@@ -7183,7 +7397,6 @@
           </w:tcPr>
           <w:p>
             <w:pPr>
-              <w:spacing w:line="360" w:lineRule="auto"/>
               <w:jc w:val="center"/>
               <w:rPr>
                 <w:sz w:val="22"/>
@@ -7210,7 +7423,6 @@
           </w:tcPr>
           <w:p>
             <w:pPr>
-              <w:spacing w:line="360" w:lineRule="auto"/>
               <w:jc w:val="center"/>
               <w:rPr>
                 <w:sz w:val="22"/>
@@ -7236,225 +7448,289 @@
     <w:p>
       <w:pPr>
         <w:spacing w:line="360" w:lineRule="auto"/>
-      </w:pPr>
-      <w:r>
-        <w:t xml:space="preserve">In the no-till and surface tillage treatments, all plots were sprayed with HP1 (2018, 2019) or HP2 (2020) before cash crop planting. For the inversion tillage treatments, no herbicide was sprayed before cash crop planting. In 2018 (spring barley), to accommodate the presence of </w:t>
-      </w:r>
-      <w:r>
+        <w:rPr>
+          <w:lang w:val="en-US"/>
+        </w:rPr>
+      </w:pPr>
+      <w:r>
+        <w:t xml:space="preserve">In the </w:t>
+      </w:r>
+      <w:r>
+        <w:t>NT</w:t>
+      </w:r>
+      <w:r>
+        <w:t xml:space="preserve"> and </w:t>
+      </w:r>
+      <w:r>
+        <w:t>SURF</w:t>
+      </w:r>
+      <w:r>
+        <w:t xml:space="preserve"> tillage treatments, all plots were sprayed before cash crop planting. For the </w:t>
+      </w:r>
+      <w:r>
+        <w:t>INV</w:t>
+      </w:r>
+      <w:r>
+        <w:t xml:space="preserve"> tillage treatments, </w:t>
+      </w:r>
+      <w:r>
+        <w:t xml:space="preserve">tillage provided weed control and therefore </w:t>
+      </w:r>
+      <w:r>
+        <w:t xml:space="preserve">no herbicide was </w:t>
+      </w:r>
+      <w:r>
+        <w:t>applied</w:t>
+      </w:r>
+      <w:r>
+        <w:t xml:space="preserve"> before cash crop planting. </w:t>
+      </w:r>
+      <w:r>
+        <w:t>For in</w:t>
+      </w:r>
+      <w:r>
+        <w:rPr>
+          <w:lang w:val="en-US"/>
+        </w:rPr>
+        <w:t xml:space="preserve">-season weed control, herbicide packages applied in the MixE treatment had to accommodate </w:t>
+      </w:r>
+      <w:r>
+        <w:t xml:space="preserve">the presence of the grass and clover </w:t>
+      </w:r>
+      <w:r>
+        <w:t>crops and were therefore different from those applied in all other cover crop treatments. After emergence</w:t>
+      </w:r>
+      <w:r>
+        <w:t xml:space="preserve">, weed surveys indicated a need to control </w:t>
+      </w:r>
+      <w:r>
+        <w:t xml:space="preserve">Canada thistle </w:t>
+      </w:r>
+      <w:r>
+        <w:t>[</w:t>
+      </w:r>
+      <w:r>
+        <w:rPr>
+          <w:i/>
+          <w:iCs/>
+        </w:rPr>
+        <w:t>Cirsium arvense</w:t>
+      </w:r>
+      <w:r>
+        <w:t xml:space="preserve"> (L.) Scop.</w:t>
+      </w:r>
+      <w:r>
+        <w:t xml:space="preserve">], </w:t>
+      </w:r>
+      <w:r>
+        <w:t xml:space="preserve">and </w:t>
+      </w:r>
+      <w:r>
+        <w:t xml:space="preserve">, herbicide applications were chosen that are effective against </w:t>
+      </w:r>
+      <w:r>
+        <w:t xml:space="preserve">this perennial weed. However, </w:t>
+      </w:r>
+      <w:r>
+        <w:t>those same herbicides could not be used in the MixE plots</w:t>
+      </w:r>
+      <w:r>
+        <w:t>, so the best available option was instead used</w:t>
+      </w:r>
+      <w:r>
+        <w:t xml:space="preserve">. </w:t>
+      </w:r>
+      <w:bookmarkStart w:id="4" w:name="_Hlk190689276"/>
+      <w:r>
+        <w:t xml:space="preserve">Following faba bean planting in 2020, all </w:t>
+      </w:r>
+      <w:r>
+        <w:t xml:space="preserve">plots received the same herbicide treatments, with special consideration to control </w:t>
+      </w:r>
+      <w:r>
+        <w:t>wild oat (</w:t>
+      </w:r>
+      <w:r>
+        <w:rPr>
+          <w:i/>
+          <w:iCs/>
+        </w:rPr>
+        <w:t>Avena fatua</w:t>
+      </w:r>
+      <w:r>
+        <w:rPr>
+          <w:i/>
+          <w:iCs/>
+        </w:rPr>
+        <w:t xml:space="preserve"> </w:t>
+      </w:r>
+      <w:r>
+        <w:t>L.</w:t>
+      </w:r>
+      <w:r>
+        <w:t xml:space="preserve">). </w:t>
+      </w:r>
+      <w:bookmarkEnd w:id="4"/>
+      <w:r>
+        <w:t>All plots were managed identically for diseases and insect pests according to Dani</w:t>
+      </w:r>
+      <w:r>
+        <w:t xml:space="preserve">sh standard recommendations and policies. </w:t>
+      </w:r>
+      <w:r>
+        <w:rPr>
+          <w:lang w:val="en-US"/>
+        </w:rPr>
+        <w:t xml:space="preserve">Herbicide use data was translated into potential toxicity loads using the </w:t>
+      </w:r>
+      <w:r>
+        <w:rPr>
+          <w:lang w:val="en-US"/>
+        </w:rPr>
+        <w:t>Danish</w:t>
+      </w:r>
+      <w:r>
+        <w:rPr>
+          <w:lang w:val="en-US"/>
+        </w:rPr>
+        <w:t xml:space="preserve"> </w:t>
+      </w:r>
+      <w:r>
+        <w:rPr>
+          <w:lang w:val="en-US"/>
+        </w:rPr>
+        <w:t xml:space="preserve">Pesticide Load </w:t>
+      </w:r>
+      <w:r>
+        <w:rPr>
+          <w:lang w:val="en-US"/>
+        </w:rPr>
+        <w:t xml:space="preserve">Indicator </w:t>
+      </w:r>
+      <w:r>
+        <w:rPr>
+          <w:lang w:val="en-US"/>
+        </w:rPr>
+        <w:t xml:space="preserve">(PLI) </w:t>
+      </w:r>
+      <w:r>
+        <w:rPr>
+          <w:lang w:val="en-US"/>
+        </w:rPr>
+        <w:t>values</w:t>
+      </w:r>
+      <w:r>
+        <w:rPr>
+          <w:lang w:val="en-US"/>
+        </w:rPr>
+        <w:t xml:space="preserve"> </w:t>
+      </w:r>
+      <w:r>
+        <w:rPr>
+          <w:lang w:val="en-US"/>
+        </w:rPr>
+        <w:fldChar w:fldCharType="begin"/>
+      </w:r>
+      <w:r>
+        <w:rPr>
+          <w:lang w:val="en-US"/>
+        </w:rPr>
+        <w:instrText xml:space="preserve"> ADDIN ZOTERO_ITEM CSL_CITATION {"citationID":"7gwdhikr","properties":{"formattedCitation":"(Kudsk et al., 2018)","plainCitation":"(Kudsk et al., 2018)","noteIndex":0},"citationItems":[{"id":49,"uris":["http://zotero.org/users/3599437/items/NAVLB2GA"],"itemData":{"id":49,"type":"article-journal","abstract":"Pesticides provide growers with an effective tool for the control of damaging crop pests preventing yield losses that could jeopardise food security. In recent years the potentially adverse effects of their use on human health and the environment has received increasing attention by the public and the competent authorities. In this context reliable pesticide risk indicators are pivotal to assess the potential risk associated with the use of pesticide. Several pesticide risk indicators, serving various purposes, have been developed over the years. Recently, a new pesticide risk indicator, the Pesticide Load (PL), was introduced in Denmark. The PL has replaced the Treatment Frequency Index (TFI) as the official pesticide risk indicator. The PL consists of three sub-indicators for human health, ecotoxicology and environmental fate, respectively. For each of the three sub-indicators a pesticide load (PL) is calculated and expressed as the PL per unit commercial product (kg, L or tablet). PL for human health (PLHH) is based on the risk phrases on the product label, while PL for ecotoxicology (PLECO) is calculated on basis of the LC/LD/EC50 values of the active ingredients for acute toxicity to mammals, birds, fish, daphnia, algae, aquatic plants, earthworms and bees and NOEC values for chronic toxicity to fish, daphnia and earthworms. PL for environmental fate (PLFATE) is calculated on basis of the half-life in soil (DT50), the bioaccumulation factor (BCF) and the SCI-GROW index. PL does not consider the actual exposure, i.e. it reflects the relative risks associated with the use of pesticides. Besides using PL for monitoring the yearly trend in pesticide use and load, the PL was also used for setting up a new pesticide tax scheme and for setting quantitative reduction targets. In Denmark, it is now compulsory for farmers to upload their pesticide use data, i.e. the annual pesticide statistics and the calculation of the PL can be produced on basis of pesticide use data rather than sales data that may not reflect the actual use by farmers. Because pesticide use data is available for each farm, maps providing detailed information on pesticide use in different regions can be produced. From 2010/11 to 2013/14 only minor differences were observed in the PL and, overall, similar trends were observed for the PL and TFI. Significant geographical differences, which could be attributed to differences in crop rotations, were apparent when estimating PL for each of the four major groups of pesticides (herbicides, fungicides, insecticides and plant growth regulators). The maps produced from the pesticide use data revealed significant variation in PL for ecotoxicological effects on aqueous organisms and bees as well as environmental parameters such as leaching potential. It is suggested to use the maps to identify ‘hot spots’ and design monitoring programmes or to launch initiatives that can reduce the PL. By linking information on mode of action to each commercial pesticide product it was also possible to obtain detailed information on the use pattern of the various pesticide modes of action, which is relevant information assessing the risk of evolution of pesticide resistance.","container-title":"Land Use Policy","DOI":"10.1016/j.landusepol.2017.11.010","ISSN":"0264-8377","journalAbbreviation":"Land Use Policy","language":"en","page":"384-393","source":"ScienceDirect","title":"Pesticide Load—A new Danish pesticide risk indicator with multiple applications","volume":"70","author":[{"family":"Kudsk","given":"Per"},{"family":"Jørgensen","given":"Lise Nistrup"},{"family":"Ørum","given":"Jens Erik"}],"issued":{"date-parts":[["2018",1,1]]}}}],"schema":"https://github.com/citation-style-language/schema/raw/master/csl-citation.json"} </w:instrText>
+      </w:r>
+      <w:r>
+        <w:rPr>
+          <w:lang w:val="en-US"/>
+        </w:rPr>
+        <w:fldChar w:fldCharType="separate"/>
+      </w:r>
+      <w:r>
+        <w:rPr>
+          <w:lang w:val="en-US"/>
+        </w:rPr>
+        <w:t>(Kudsk et al., 2018)</w:t>
+      </w:r>
+      <w:r>
+        <w:rPr>
+          <w:lang w:val="en-US"/>
+        </w:rPr>
+        <w:fldChar w:fldCharType="end"/>
+      </w:r>
+      <w:r>
+        <w:rPr>
+          <w:lang w:val="en-US"/>
+        </w:rPr>
+        <w:t>.</w:t>
+      </w:r>
+    </w:p>
+    <w:p>
+      <w:pPr>
+        <w:spacing w:line="360" w:lineRule="auto"/>
+        <w:rPr>
+          <w:lang w:val="en-US"/>
+        </w:rPr>
+      </w:pPr>
+      <w:r>
+        <w:rPr>
+          <w:lang w:val="en-US"/>
+        </w:rPr>
+        <w:t xml:space="preserve">The long-term experiment is rainfed, but in 2018 an exception was made due to an extremely hot and dry early growing season. In order to maintain the long-term viability of the experiment, all plots were irrigated with 25 mm in early June to ensure the establishment of all treatments. Irrigation was done with sprinklers mounted on a boom that was dragged </w:t>
+      </w:r>
+      <w:r>
+        <w:rPr>
+          <w:lang w:val="en-US"/>
+        </w:rPr>
         <w:lastRenderedPageBreak/>
-        <w:t>the grass and clover present in the Mix-early plots, those plots were sprayed on 16 May 2018 with an herbicide package that does not affect clover or grasses (HP3); all other plots were sprayed the same day with a different herbicide package (HP4).</w:t>
-      </w:r>
-      <w:r>
+        <w:t>through the experiment.</w:t>
+      </w:r>
+      <w:r>
+        <w:rPr>
+          <w:lang w:val="en-US"/>
+        </w:rPr>
+        <w:t xml:space="preserve"> This was also done on production fields in Denmark with access to irrigation structure</w:t>
+      </w:r>
+      <w:r>
+        <w:rPr>
+          <w:lang w:val="en-US"/>
+        </w:rPr>
+        <w:t>, and therefore represents realistic production management</w:t>
+      </w:r>
+      <w:r>
+        <w:rPr>
+          <w:lang w:val="en-US"/>
+        </w:rPr>
+        <w:t xml:space="preserve">. </w:t>
+      </w:r>
+      <w:r>
+        <w:rPr>
+          <w:lang w:val="en-US"/>
+        </w:rPr>
         <w:t xml:space="preserve"> </w:t>
       </w:r>
-      <w:r>
-        <w:t>On 29 May 2018, all plots except the Mix-early plots were sprayed (HP5) to control Canada thistle (</w:t>
-      </w:r>
-      <w:r>
-        <w:rPr>
-          <w:i/>
-          <w:iCs/>
-        </w:rPr>
-        <w:t>Cirsium arvense</w:t>
-      </w:r>
-      <w:r>
-        <w:t xml:space="preserve"> (L.) Scop.</w:t>
-      </w:r>
-      <w:r>
-        <w:t xml:space="preserve">); Mix-early plots were not sprayed because HP5 would have terminated the cover crop. In 2019 (spring oat), on 14 May the Mix-early plots were again sprayed with the same herbicide package used in 2018 (HP3) while all other plots were sprayed with a different </w:t>
-      </w:r>
-      <w:r>
-        <w:t xml:space="preserve">‘stronger’ </w:t>
-      </w:r>
-      <w:r>
-        <w:t>package (HP6)</w:t>
-      </w:r>
-      <w:r>
-        <w:t xml:space="preserve"> to control more weeds, based on early spring surveys</w:t>
-      </w:r>
-      <w:r>
-        <w:t xml:space="preserve">. </w:t>
-      </w:r>
-      <w:bookmarkStart w:id="4" w:name="_Hlk190689276"/>
-    </w:p>
-    <w:p>
-      <w:pPr>
-        <w:spacing w:line="360" w:lineRule="auto"/>
-        <w:rPr>
-          <w:lang w:val="en-US"/>
-        </w:rPr>
-      </w:pPr>
-      <w:r>
-        <w:t>Following faba bean planting in 2020, all plots were sprayed with HP7 on 6 May 2020 and again on 20 May 2020. On 2 June 2020, all plots were sprayed (HP8) to control wild oat (</w:t>
-      </w:r>
-      <w:r>
-        <w:rPr>
-          <w:i/>
-          <w:iCs/>
-        </w:rPr>
-        <w:t>Avena fatua</w:t>
-      </w:r>
-      <w:r>
-        <w:rPr>
-          <w:i/>
-          <w:iCs/>
-        </w:rPr>
-        <w:t xml:space="preserve"> </w:t>
-      </w:r>
-      <w:r>
-        <w:t>L.</w:t>
-      </w:r>
-      <w:r>
-        <w:t xml:space="preserve">). </w:t>
-      </w:r>
-      <w:bookmarkEnd w:id="4"/>
-      <w:r>
-        <w:t>All plots were managed identically for diseases and insect pests according to Dani</w:t>
-      </w:r>
-      <w:r>
-        <w:t xml:space="preserve">sh standard recommendations and policies. </w:t>
-      </w:r>
-      <w:r>
-        <w:rPr>
-          <w:lang w:val="en-US"/>
-        </w:rPr>
-        <w:t xml:space="preserve">Herbicide use data was translated into potential toxicity loads using the </w:t>
-      </w:r>
-      <w:r>
-        <w:rPr>
-          <w:lang w:val="en-US"/>
-        </w:rPr>
-        <w:t>Danish</w:t>
-      </w:r>
-      <w:r>
-        <w:rPr>
-          <w:lang w:val="en-US"/>
-        </w:rPr>
-        <w:t xml:space="preserve"> </w:t>
-      </w:r>
-      <w:r>
-        <w:rPr>
-          <w:lang w:val="en-US"/>
-        </w:rPr>
-        <w:t xml:space="preserve">Pesticide Load </w:t>
-      </w:r>
-      <w:r>
-        <w:rPr>
-          <w:lang w:val="en-US"/>
-        </w:rPr>
-        <w:t xml:space="preserve">Indicator </w:t>
-      </w:r>
-      <w:r>
-        <w:rPr>
-          <w:lang w:val="en-US"/>
-        </w:rPr>
-        <w:t>values</w:t>
-      </w:r>
-      <w:r>
-        <w:rPr>
-          <w:lang w:val="en-US"/>
-        </w:rPr>
-        <w:t xml:space="preserve"> </w:t>
-      </w:r>
-      <w:r>
-        <w:rPr>
-          <w:lang w:val="en-US"/>
-        </w:rPr>
-        <w:t>[</w:t>
-      </w:r>
-      <w:r>
-        <w:rPr>
-          <w:lang w:val="en-US"/>
-        </w:rPr>
-        <w:t>PLI;</w:t>
-      </w:r>
-      <w:r>
-        <w:rPr>
-          <w:lang w:val="en-US"/>
-        </w:rPr>
-        <w:t xml:space="preserve"> </w:t>
-      </w:r>
-      <w:r>
-        <w:rPr>
-          <w:lang w:val="en-US"/>
-        </w:rPr>
-        <w:fldChar w:fldCharType="begin"/>
-      </w:r>
-      <w:r>
-        <w:rPr>
-          <w:lang w:val="en-US"/>
-        </w:rPr>
-        <w:instrText xml:space="preserve"> ADDIN ZOTERO_ITEM CSL_CITATION {"citationID":"7gwdhikr","properties":{"formattedCitation":"(Kudsk et al., 2018)","plainCitation":"(Kudsk et al., 2018)","noteIndex":0},"citationItems":[{"id":49,"uris":["http://zotero.org/users/3599437/items/NAVLB2GA"],"itemData":{"id":49,"type":"article-journal","abstract":"Pesticides provide growers with an effective tool for the control of damaging crop pests preventing yield losses that could jeopardise food security. In recent years the potentially adverse effects of their use on human health and the environment has received increasing attention by the public and the competent authorities. In this context reliable pesticide risk indicators are pivotal to assess the potential risk associated with the use of pesticide. Several pesticide risk indicators, serving various purposes, have been developed over the years. Recently, a new pesticide risk indicator, the Pesticide Load (PL), was introduced in Denmark. The PL has replaced the Treatment Frequency Index (TFI) as the official pesticide risk indicator. The PL consists of three sub-indicators for human health, ecotoxicology and environmental fate, respectively. For each of the three sub-indicators a pesticide load (PL) is calculated and expressed as the PL per unit commercial product (kg, L or tablet). PL for human health (PLHH) is based on the risk phrases on the product label, while PL for ecotoxicology (PLECO) is calculated on basis of the LC/LD/EC50 values of the active ingredients for acute toxicity to mammals, birds, fish, daphnia, algae, aquatic plants, earthworms and bees and NOEC values for chronic toxicity to fish, daphnia and earthworms. PL for environmental fate (PLFATE) is calculated on basis of the half-life in soil (DT50), the bioaccumulation factor (BCF) and the SCI-GROW index. PL does not consider the actual exposure, i.e. it reflects the relative risks associated with the use of pesticides. Besides using PL for monitoring the yearly trend in pesticide use and load, the PL was also used for setting up a new pesticide tax scheme and for setting quantitative reduction targets. In Denmark, it is now compulsory for farmers to upload their pesticide use data, i.e. the annual pesticide statistics and the calculation of the PL can be produced on basis of pesticide use data rather than sales data that may not reflect the actual use by farmers. Because pesticide use data is available for each farm, maps providing detailed information on pesticide use in different regions can be produced. From 2010/11 to 2013/14 only minor differences were observed in the PL and, overall, similar trends were observed for the PL and TFI. Significant geographical differences, which could be attributed to differences in crop rotations, were apparent when estimating PL for each of the four major groups of pesticides (herbicides, fungicides, insecticides and plant growth regulators). The maps produced from the pesticide use data revealed significant variation in PL for ecotoxicological effects on aqueous organisms and bees as well as environmental parameters such as leaching potential. It is suggested to use the maps to identify ‘hot spots’ and design monitoring programmes or to launch initiatives that can reduce the PL. By linking information on mode of action to each commercial pesticide product it was also possible to obtain detailed information on the use pattern of the various pesticide modes of action, which is relevant information assessing the risk of evolution of pesticide resistance.","container-title":"Land Use Policy","DOI":"10.1016/j.landusepol.2017.11.010","ISSN":"0264-8377","journalAbbreviation":"Land Use Policy","language":"en","page":"384-393","source":"ScienceDirect","title":"Pesticide Load—A new Danish pesticide risk indicator with multiple applications","volume":"70","author":[{"family":"Kudsk","given":"Per"},{"family":"Jørgensen","given":"Lise Nistrup"},{"family":"Ørum","given":"Jens Erik"}],"issued":{"date-parts":[["2018",1,1]]}}}],"schema":"https://github.com/citation-style-language/schema/raw/master/csl-citation.json"} </w:instrText>
-      </w:r>
-      <w:r>
-        <w:rPr>
-          <w:lang w:val="en-US"/>
-        </w:rPr>
-        <w:fldChar w:fldCharType="separate"/>
-      </w:r>
-      <w:r>
-        <w:rPr>
-          <w:lang w:val="en-US"/>
-        </w:rPr>
-        <w:t>(Kudsk et al., 2018)</w:t>
-      </w:r>
-      <w:r>
-        <w:rPr>
-          <w:lang w:val="en-US"/>
-        </w:rPr>
-        <w:fldChar w:fldCharType="end"/>
-      </w:r>
-      <w:r>
-        <w:rPr>
-          <w:lang w:val="en-US"/>
-        </w:rPr>
-        <w:t>]</w:t>
-      </w:r>
-      <w:r>
-        <w:rPr>
-          <w:lang w:val="en-US"/>
-        </w:rPr>
-        <w:t>.</w:t>
-      </w:r>
-    </w:p>
-    <w:p>
-      <w:pPr>
-        <w:spacing w:line="360" w:lineRule="auto"/>
-        <w:rPr>
-          <w:lang w:val="en-US"/>
-        </w:rPr>
-      </w:pPr>
-      <w:r>
-        <w:rPr>
-          <w:lang w:val="en-US"/>
-        </w:rPr>
-        <w:t>The long-term experiment is rainfed, but in 2018 an exception was made due to an extremely hot and dry early growing season. In order to maintain the long-term viability of the experiment, all plots were irrigated with 25 mm in early June to ensure the establishment of all treatments. Irrigation was done with sprinklers mounted on a boom that was dragged through the experiment.</w:t>
-      </w:r>
-      <w:r>
-        <w:rPr>
-          <w:lang w:val="en-US"/>
-        </w:rPr>
-        <w:t xml:space="preserve"> This was also done on production fields in Denmark with access to irrigation structure. </w:t>
-      </w:r>
-      <w:r>
-        <w:rPr>
-          <w:lang w:val="en-US"/>
-        </w:rPr>
-        <w:t xml:space="preserve"> </w:t>
-      </w:r>
-    </w:p>
-    <w:p>
-      <w:pPr>
-        <w:spacing w:line="360" w:lineRule="auto"/>
-        <w:rPr>
-          <w:lang w:val="en-US"/>
-        </w:rPr>
-      </w:pPr>
-      <w:r>
-        <w:rPr>
-          <w:lang w:val="en-US"/>
-        </w:rPr>
-        <w:t xml:space="preserve">Weather data for the present study was obtained from the Danish Meteorological Institute's (DMI) Open Data API for the Flakkebjerg station (55.322, 11.388). The 30-year (1990-2020) mean annual temperature and precipitation for the site are 8.9 degrees Celsius and 589 mm, respectively. </w:t>
+    </w:p>
+    <w:p>
+      <w:pPr>
+        <w:spacing w:line="360" w:lineRule="auto"/>
+        <w:rPr>
+          <w:lang w:val="en-US"/>
+        </w:rPr>
+      </w:pPr>
+      <w:r>
+        <w:rPr>
+          <w:lang w:val="en-US"/>
+        </w:rPr>
+        <w:t>Weather data for the present study was obtained from the Danish Meteorological Institute's (DMI) Open Data API for the Flakkebjerg station (55.322, 11.388)</w:t>
+      </w:r>
+      <w:r>
+        <w:rPr>
+          <w:lang w:val="en-US"/>
+        </w:rPr>
+        <w:t>, located less than 1 km from the present study</w:t>
+      </w:r>
+      <w:r>
+        <w:rPr>
+          <w:lang w:val="en-US"/>
+        </w:rPr>
+        <w:t xml:space="preserve">. The 30-year (1990-2020) mean annual temperature and precipitation for the site are 8.9 degrees Celsius and 589 mm, respectively. </w:t>
       </w:r>
     </w:p>
     <w:p>
@@ -7531,31 +7807,46 @@
         <w:spacing w:line="360" w:lineRule="auto"/>
       </w:pPr>
       <w:r>
-        <w:t>Each sub-subplot (net size 10 m x 1.5 m) was harvested for grain yield with a plot combine</w:t>
+        <w:t xml:space="preserve">Each </w:t>
+      </w:r>
+      <w:r>
+        <w:t>micro-plot</w:t>
+      </w:r>
+      <w:r>
+        <w:t xml:space="preserve"> (net size 10 m x 1.5 m) was harvested for grain yield with a plot combine</w:t>
       </w:r>
       <w:r>
         <w:t>r</w:t>
       </w:r>
       <w:r>
-        <w:t xml:space="preserve"> (</w:t>
-      </w:r>
-      <w:r>
-        <w:t xml:space="preserve">spring barley: </w:t>
-      </w:r>
-      <w:r>
-        <w:t>8 August 2018</w:t>
-      </w:r>
-      <w:r>
-        <w:t xml:space="preserve">, oat: </w:t>
+        <w:t xml:space="preserve"> (8 August 2018</w:t>
+      </w:r>
+      <w:r>
+        <w:t xml:space="preserve">, </w:t>
       </w:r>
       <w:r>
         <w:t>15 August 2019</w:t>
       </w:r>
       <w:r>
-        <w:t xml:space="preserve">, faba bean: </w:t>
-      </w:r>
-      <w:r>
-        <w:t xml:space="preserve">24 August 2020 faba bean). Dry matter content was determined by a near-infrared spectroscopy analyzer </w:t>
+        <w:t xml:space="preserve">, </w:t>
+      </w:r>
+      <w:r>
+        <w:t xml:space="preserve">and </w:t>
+      </w:r>
+      <w:r>
+        <w:t>24 August 2020</w:t>
+      </w:r>
+      <w:r>
+        <w:t xml:space="preserve"> for spring barley, spring oat, and</w:t>
+      </w:r>
+      <w:r>
+        <w:t xml:space="preserve"> faba bean</w:t>
+      </w:r>
+      <w:r>
+        <w:t>, respectively</w:t>
+      </w:r>
+      <w:r>
+        <w:t xml:space="preserve">). Dry matter content was determined by a near-infrared spectroscopy analyzer </w:t>
       </w:r>
       <w:r>
         <w:t>[</w:t>
@@ -7649,7 +7940,6 @@
         <w:rPr>
           <w:lang w:val="en-US"/>
         </w:rPr>
-        <w:lastRenderedPageBreak/>
         <w:t xml:space="preserve">Three categories of vegetation measurements were taken (Table </w:t>
       </w:r>
       <w:r>
@@ -7726,7 +8016,6 @@
           </w:tcPr>
           <w:p>
             <w:pPr>
-              <w:spacing w:line="360" w:lineRule="auto"/>
               <w:rPr>
                 <w:lang w:val="en-US"/>
               </w:rPr>
@@ -7751,7 +8040,6 @@
           </w:tcPr>
           <w:p>
             <w:pPr>
-              <w:spacing w:line="360" w:lineRule="auto"/>
               <w:rPr>
                 <w:lang w:val="en-US"/>
               </w:rPr>
@@ -7778,7 +8066,6 @@
           </w:tcPr>
           <w:p>
             <w:pPr>
-              <w:spacing w:line="360" w:lineRule="auto"/>
               <w:rPr>
                 <w:lang w:val="en-US"/>
               </w:rPr>
@@ -7803,7 +8090,6 @@
           </w:tcPr>
           <w:p>
             <w:pPr>
-              <w:spacing w:line="360" w:lineRule="auto"/>
               <w:rPr>
                 <w:lang w:val="en-US"/>
               </w:rPr>
@@ -7817,7 +8103,6 @@
           </w:p>
           <w:p>
             <w:pPr>
-              <w:spacing w:line="360" w:lineRule="auto"/>
               <w:rPr>
                 <w:lang w:val="en-US"/>
               </w:rPr>
@@ -7826,12 +8111,19 @@
               <w:rPr>
                 <w:lang w:val="en-US"/>
               </w:rPr>
-              <w:t>Species (AVESA*, CAPBP, CIRAR, EPHEX, HORVW, LOLPE, MATIN, PAPRH, RAPSR, TAROF, TRFRE)</w:t>
+              <w:t xml:space="preserve">Species </w:t>
+            </w:r>
+            <w:r>
+              <w:rPr>
+                <w:i/>
+                <w:iCs/>
+                <w:lang w:val="en-US"/>
+              </w:rPr>
+              <w:t>(AVESA*, CAPBP, CIRAR, EPHEX, HORVW, LOLPE, MATIN, PAPRH, RAPSR, TAROF, TRFRE)</w:t>
             </w:r>
           </w:p>
           <w:p>
             <w:pPr>
-              <w:spacing w:line="360" w:lineRule="auto"/>
               <w:rPr>
                 <w:lang w:val="en-US"/>
               </w:rPr>
@@ -7840,7 +8132,15 @@
               <w:rPr>
                 <w:lang w:val="en-US"/>
               </w:rPr>
-              <w:t>Genus (GERSS, LAMSS, SENSS, VERSS)</w:t>
+              <w:t xml:space="preserve">Genus </w:t>
+            </w:r>
+            <w:r>
+              <w:rPr>
+                <w:i/>
+                <w:iCs/>
+                <w:lang w:val="en-US"/>
+              </w:rPr>
+              <w:t>(GERSS, LAMSS, SENSS, VERSS)</w:t>
             </w:r>
           </w:p>
         </w:tc>
@@ -7858,7 +8158,6 @@
           </w:tcPr>
           <w:p>
             <w:pPr>
-              <w:spacing w:line="360" w:lineRule="auto"/>
               <w:rPr>
                 <w:lang w:val="en-US"/>
               </w:rPr>
@@ -7883,7 +8182,6 @@
           </w:tcPr>
           <w:p>
             <w:pPr>
-              <w:spacing w:line="360" w:lineRule="auto"/>
               <w:rPr>
                 <w:lang w:val="en-US"/>
               </w:rPr>
@@ -7897,7 +8195,6 @@
           </w:p>
           <w:p>
             <w:pPr>
-              <w:spacing w:line="360" w:lineRule="auto"/>
               <w:rPr>
                 <w:lang w:val="en-US"/>
               </w:rPr>
@@ -7906,7 +8203,15 @@
               <w:rPr>
                 <w:lang w:val="en-US"/>
               </w:rPr>
-              <w:t>Other (all other biomass)</w:t>
+              <w:t xml:space="preserve">Other </w:t>
+            </w:r>
+            <w:r>
+              <w:rPr>
+                <w:i/>
+                <w:iCs/>
+                <w:lang w:val="en-US"/>
+              </w:rPr>
+              <w:t>(all other biomass)</w:t>
             </w:r>
           </w:p>
         </w:tc>
@@ -7924,7 +8229,6 @@
           </w:tcPr>
           <w:p>
             <w:pPr>
-              <w:spacing w:line="360" w:lineRule="auto"/>
               <w:rPr>
                 <w:lang w:val="en-US"/>
               </w:rPr>
@@ -7962,7 +8266,6 @@
           </w:tcPr>
           <w:p>
             <w:pPr>
-              <w:spacing w:line="360" w:lineRule="auto"/>
               <w:rPr>
                 <w:lang w:val="en-US"/>
               </w:rPr>
@@ -7976,7 +8279,6 @@
           </w:p>
           <w:p>
             <w:pPr>
-              <w:spacing w:line="360" w:lineRule="auto"/>
               <w:rPr>
                 <w:lang w:val="en-US"/>
               </w:rPr>
@@ -7990,7 +8292,6 @@
           </w:p>
           <w:p>
             <w:pPr>
-              <w:spacing w:line="360" w:lineRule="auto"/>
               <w:rPr>
                 <w:lang w:val="en-US"/>
               </w:rPr>
@@ -8004,7 +8305,6 @@
           </w:p>
           <w:p>
             <w:pPr>
-              <w:spacing w:line="360" w:lineRule="auto"/>
               <w:rPr>
                 <w:lang w:val="en-US"/>
               </w:rPr>
@@ -8032,7 +8332,6 @@
           </w:tcPr>
           <w:p>
             <w:pPr>
-              <w:spacing w:line="360" w:lineRule="auto"/>
               <w:rPr>
                 <w:lang w:val="en-US"/>
               </w:rPr>
@@ -8130,7 +8429,19 @@
         <w:rPr>
           <w:lang w:val="en-US"/>
         </w:rPr>
-        <w:t> quadrat was placed in the plot, and an image was taken from a height of 1 m above the center of the quadrat. Three images were taken in each plot, meaning 10% of the sub-subplot area was sampled (1.5 m</w:t>
+        <w:t xml:space="preserve"> quadrat was placed in the plot, and an image was taken from a height of 1 m above the center of the quadrat. Three images were taken in each plot, meaning 10% of the </w:t>
+      </w:r>
+      <w:r>
+        <w:rPr>
+          <w:lang w:val="en-US"/>
+        </w:rPr>
+        <w:t>micro-plot</w:t>
+      </w:r>
+      <w:r>
+        <w:rPr>
+          <w:lang w:val="en-US"/>
+        </w:rPr>
+        <w:t xml:space="preserve"> area was sampled (1.5 m</w:t>
       </w:r>
       <w:r>
         <w:rPr>
@@ -8162,7 +8473,14 @@
         <w:rPr>
           <w:lang w:val="en-US"/>
         </w:rPr>
-        <w:t xml:space="preserve"> (</w:t>
+        <w:t xml:space="preserve"> </w:t>
+      </w:r>
+      <w:r>
+        <w:rPr>
+          <w:lang w:val="en-US"/>
+        </w:rPr>
+        <w:lastRenderedPageBreak/>
+        <w:t>(</w:t>
       </w:r>
       <w:r>
         <w:rPr>
@@ -8180,7 +8498,19 @@
         <w:rPr>
           <w:lang w:val="en-US"/>
         </w:rPr>
-        <w:t>. Each intersection was classified as a soil or plant. Plant intersections were further classified to the species (12) or genus (4) level (Table 2). Percent coverage of each type was then calculated by dividing the number of touched intersections in that category by 289 intersections. For categorical analyses</w:t>
+        <w:t xml:space="preserve">. Each intersection was classified as a soil or plant. Plant intersections were further classified to the species (12) or genus (4) level (Table </w:t>
+      </w:r>
+      <w:r>
+        <w:rPr>
+          <w:lang w:val="en-US"/>
+        </w:rPr>
+        <w:t>3</w:t>
+      </w:r>
+      <w:r>
+        <w:rPr>
+          <w:lang w:val="en-US"/>
+        </w:rPr>
+        <w:t>). Percent coverage of each type was then calculated by dividing the number of touched intersections in that category by 289 intersections. For categorical analyses</w:t>
       </w:r>
       <w:r>
         <w:rPr>
@@ -8192,7 +8522,19 @@
         <w:rPr>
           <w:lang w:val="en-US"/>
         </w:rPr>
-        <w:t>, each species/genus was classified as ‘cover crop’, ‘volunteer’ or ‘other</w:t>
+        <w:t xml:space="preserve">, each species/genus was classified as ‘cover crop’, </w:t>
+      </w:r>
+      <w:r>
+        <w:rPr>
+          <w:lang w:val="en-US"/>
+        </w:rPr>
+        <w:t xml:space="preserve">‘weed’, </w:t>
+      </w:r>
+      <w:r>
+        <w:rPr>
+          <w:lang w:val="en-US"/>
+        </w:rPr>
+        <w:t>‘volunteer’ or ‘other</w:t>
       </w:r>
       <w:r>
         <w:rPr>
@@ -8287,20 +8629,19 @@
         <w:rPr>
           <w:lang w:val="en-US"/>
         </w:rPr>
-        <w:t xml:space="preserve">The amount of aboveground vegetative biomass in each treatment was measured shortly after image collection for fall ground cover measurements (15 November 2018 and 13 November 2019, respectively). Two 0.5 m2 quadrats were randomly placed in each plot, and all </w:t>
-      </w:r>
-      <w:r>
-        <w:rPr>
-          <w:lang w:val="en-US"/>
-        </w:rPr>
-        <w:lastRenderedPageBreak/>
-        <w:t xml:space="preserve">aboveground biomass was cut at ground level and removed. The biomass samples from the two quadrats were separated into three fractions: cover crops, </w:t>
-      </w:r>
-      <w:r>
-        <w:rPr>
-          <w:lang w:val="en-US"/>
-        </w:rPr>
-        <w:t>volunteers, and other</w:t>
+        <w:t xml:space="preserve">The amount of aboveground vegetative biomass in each treatment was measured shortly after image collection (15 November 2018 and 13 November 2019, respectively). Two 0.5 m2 quadrats were randomly placed in each plot, and all aboveground biomass was cut at ground level and removed. The biomass samples from the two quadrats were separated into three fractions: cover crops, </w:t>
+      </w:r>
+      <w:r>
+        <w:rPr>
+          <w:lang w:val="en-US"/>
+        </w:rPr>
+        <w:t xml:space="preserve">volunteers, and </w:t>
+      </w:r>
+      <w:r>
+        <w:rPr>
+          <w:lang w:val="en-US"/>
+        </w:rPr>
+        <w:t>weeds</w:t>
       </w:r>
       <w:r>
         <w:rPr>
@@ -8318,7 +8659,19 @@
         <w:rPr>
           <w:lang w:val="en-US"/>
         </w:rPr>
-        <w:t>statistics (Table 2). The biomass fractions were dried in the oven at 80</w:t>
+        <w:t xml:space="preserve">statistics (Table </w:t>
+      </w:r>
+      <w:r>
+        <w:rPr>
+          <w:lang w:val="en-US"/>
+        </w:rPr>
+        <w:t>3</w:t>
+      </w:r>
+      <w:r>
+        <w:rPr>
+          <w:lang w:val="en-US"/>
+        </w:rPr>
+        <w:t>). The biomass fractions were dried in the oven at 80</w:t>
       </w:r>
       <w:r>
         <w:rPr>
@@ -8632,7 +8985,11 @@
         <w:t>parasitic</w:t>
       </w:r>
       <w:r>
-        <w:t xml:space="preserve"> wasps. Organ level attributes reported by Yvoz et al. 2021 for 155 plant species were used to assign sub-index values. Out of the 11 species in our study, six had exact matches in </w:t>
+        <w:t xml:space="preserve"> </w:t>
+      </w:r>
+      <w:r>
+        <w:lastRenderedPageBreak/>
+        <w:t xml:space="preserve">wasps. Organ level attributes reported by Yvoz et al. 2021 for 155 plant species were used to assign sub-index values. Out of the 11 species in our study, six had exact matches in </w:t>
       </w:r>
       <w:r>
         <w:t>the Yvoz et al.</w:t>
@@ -8683,13 +9040,16 @@
         <w:t xml:space="preserve">assigned </w:t>
       </w:r>
       <w:r>
+        <w:t xml:space="preserve">no </w:t>
+      </w:r>
+      <w:r>
         <w:t xml:space="preserve">ecological </w:t>
       </w:r>
       <w:r>
-        <w:t>values of 0</w:t>
-      </w:r>
-      <w:r>
-        <w:t xml:space="preserve">  based on </w:t>
+        <w:t>value</w:t>
+      </w:r>
+      <w:r>
+        <w:t xml:space="preserve"> based on </w:t>
       </w:r>
       <w:r>
         <w:t>an assumption of</w:t>
@@ -8749,11 +9109,7 @@
         <w:t xml:space="preserve"> </w:t>
       </w:r>
       <w:r>
-        <w:t xml:space="preserve">For </w:t>
-      </w:r>
-      <w:r>
-        <w:lastRenderedPageBreak/>
-        <w:t>comparison, w</w:t>
+        <w:t>For comparison, w</w:t>
       </w:r>
       <w:r>
         <w:t>inter</w:t>
@@ -8987,7 +9343,19 @@
         <w:rPr>
           <w:lang w:val="en-US"/>
         </w:rPr>
-        <w:t xml:space="preserve"> (described above)</w:t>
+        <w:t xml:space="preserve"> (</w:t>
+      </w:r>
+      <w:r>
+        <w:rPr>
+          <w:lang w:val="en-US"/>
+        </w:rPr>
+        <w:t xml:space="preserve">proxies </w:t>
+      </w:r>
+      <w:r>
+        <w:rPr>
+          <w:lang w:val="en-US"/>
+        </w:rPr>
+        <w:t>described above)</w:t>
       </w:r>
     </w:p>
     <w:p>
@@ -9079,7 +9447,14 @@
         <w:t xml:space="preserve"> </w:t>
       </w:r>
       <w:r>
-        <w:t xml:space="preserve">First, mean values for each cropping system were </w:t>
+        <w:lastRenderedPageBreak/>
+        <w:t xml:space="preserve">First, </w:t>
+      </w:r>
+      <w:r>
+        <w:t xml:space="preserve">estimated marginal </w:t>
+      </w:r>
+      <w:r>
+        <w:t xml:space="preserve">mean values for each cropping system were </w:t>
       </w:r>
       <w:r>
         <w:t>extracted from statistical models</w:t>
@@ -9096,41 +9471,7 @@
         <w:spacing w:line="360" w:lineRule="auto"/>
       </w:pPr>
       <w:r>
-        <w:t xml:space="preserve">In all </w:t>
-      </w:r>
-      <w:r>
-        <w:t>metrics</w:t>
-      </w:r>
-      <w:r>
-        <w:t xml:space="preserve">, a </w:t>
-      </w:r>
-      <w:r>
-        <w:t xml:space="preserve">value of </w:t>
-      </w:r>
-      <w:r>
-        <w:t>zero ha</w:t>
-      </w:r>
-      <w:r>
-        <w:t>d</w:t>
-      </w:r>
-      <w:r>
-        <w:t xml:space="preserve"> a physical interpretation, so we scaled the performances by dividing by the maximum performance value</w:t>
-      </w:r>
-      <w:r>
-        <w:t xml:space="preserve"> observed</w:t>
-      </w:r>
-      <w:r>
-        <w:t xml:space="preserve">, thus retaining a meaningful zero interpretation and avoiding exaggeration of small differences in absolute performances – this </w:t>
-      </w:r>
-      <w:r>
-        <w:lastRenderedPageBreak/>
-        <w:t>scaled all performance</w:t>
-      </w:r>
-      <w:r>
-        <w:t xml:space="preserve">s in each metric to </w:t>
-      </w:r>
-      <w:r>
-        <w:t xml:space="preserve">a scale from 0 to 1. When performance metrics represented a situation wherein a higher value is less desirable (e.g., perennial weed counts), </w:t>
+        <w:t xml:space="preserve">When performance metrics represented a situation wherein a higher value is less desirable (e.g., perennial weed counts), </w:t>
       </w:r>
       <w:r>
         <w:t>the performances were flipped by taking a value of one and subtracting the performance</w:t>
@@ -9549,10 +9890,10 @@
               </w:rPr>
               <w:lastRenderedPageBreak/>
               <w:drawing>
-                <wp:inline distT="0" distB="0" distL="0" distR="0" wp14:anchorId="178FF765" wp14:editId="45EC66D0">
+                <wp:inline distT="0" distB="0" distL="0" distR="0" wp14:anchorId="32ACCD93" wp14:editId="048A6B0C">
                   <wp:extent cx="5731510" cy="4457700"/>
                   <wp:effectExtent l="0" t="0" r="2540" b="0"/>
-                  <wp:docPr id="470902165" name="Picture 2"/>
+                  <wp:docPr id="1666880" name="Picture 1"/>
                   <wp:cNvGraphicFramePr>
                     <a:graphicFrameLocks xmlns:a="http://schemas.openxmlformats.org/drawingml/2006/main" noChangeAspect="1"/>
                   </wp:cNvGraphicFramePr>
@@ -9560,10 +9901,8 @@
                     <a:graphicData uri="http://schemas.openxmlformats.org/drawingml/2006/picture">
                       <pic:pic xmlns:pic="http://schemas.openxmlformats.org/drawingml/2006/picture">
                         <pic:nvPicPr>
-                          <pic:cNvPr id="0" name="Picture 6"/>
-                          <pic:cNvPicPr>
-                            <a:picLocks noChangeAspect="1" noChangeArrowheads="1"/>
-                          </pic:cNvPicPr>
+                          <pic:cNvPr id="1666880" name="Picture 1666880"/>
+                          <pic:cNvPicPr/>
                         </pic:nvPicPr>
                         <pic:blipFill>
                           <a:blip r:embed="rId13" cstate="print">
@@ -9573,12 +9912,11 @@
                               </a:ext>
                             </a:extLst>
                           </a:blip>
-                          <a:srcRect/>
                           <a:stretch>
                             <a:fillRect/>
                           </a:stretch>
                         </pic:blipFill>
-                        <pic:spPr bwMode="auto">
+                        <pic:spPr>
                           <a:xfrm>
                             <a:off x="0" y="0"/>
                             <a:ext cx="5731510" cy="4457700"/>
@@ -9586,10 +9924,6 @@
                           <a:prstGeom prst="rect">
                             <a:avLst/>
                           </a:prstGeom>
-                          <a:noFill/>
-                          <a:ln>
-                            <a:noFill/>
-                          </a:ln>
                         </pic:spPr>
                       </pic:pic>
                     </a:graphicData>
@@ -9650,7 +9984,28 @@
                 <w:i/>
                 <w:iCs/>
               </w:rPr>
-              <w:t xml:space="preserve">. (Bottom) Study yields were comparable to mean yields observed in Denmark for each year (horizontal dashed lines) and </w:t>
+              <w:t xml:space="preserve">. (Bottom) </w:t>
+            </w:r>
+            <w:r>
+              <w:rPr>
+                <w:i/>
+                <w:iCs/>
+              </w:rPr>
+              <w:t xml:space="preserve">Yields (presented as estimated marginal means with 95% confidence intervals) </w:t>
+            </w:r>
+            <w:r>
+              <w:rPr>
+                <w:i/>
+                <w:iCs/>
+              </w:rPr>
+              <w:t xml:space="preserve">were comparable to mean yields observed in Denmark for each year (horizontal dashed lines) and </w:t>
+            </w:r>
+            <w:r>
+              <w:rPr>
+                <w:i/>
+                <w:iCs/>
+              </w:rPr>
+              <w:t xml:space="preserve">within a crop year </w:t>
             </w:r>
             <w:r>
               <w:rPr>
@@ -9708,7 +10063,13 @@
         <w:spacing w:line="360" w:lineRule="auto"/>
       </w:pPr>
       <w:r>
-        <w:t>Yields varied significantly by crop (p&lt;0.001) and by cover crop treatment (p&lt;0.001), but did not vary significantly by any other factors or their interactions. In 2018 spring barley yields averaged 4.07 Mg ha</w:t>
+        <w:t>Yields varied significantly by crop</w:t>
+      </w:r>
+      <w:r>
+        <w:t xml:space="preserve"> year</w:t>
+      </w:r>
+      <w:r>
+        <w:t xml:space="preserve"> (p&lt;0.001) and by cover crop treatment (p&lt;0.001), but did not vary significantly by any other factors or their interactions. In 2018 spring barley yields averaged 4.07 Mg ha</w:t>
       </w:r>
       <w:r>
         <w:rPr>
@@ -9717,7 +10078,7 @@
         <w:t>-1</w:t>
       </w:r>
       <w:r>
-        <w:t xml:space="preserve">, in 2019 </w:t>
+        <w:t xml:space="preserve"> in 2019 </w:t>
       </w:r>
       <w:r>
         <w:t xml:space="preserve">spring </w:t>
@@ -9741,7 +10102,13 @@
         <w:t>-1</w:t>
       </w:r>
       <w:r>
-        <w:t>. On average, the RadM cover crop treatment exhibited 8% higher crop yields compared to all other cover crop treatments</w:t>
+        <w:t xml:space="preserve">. </w:t>
+      </w:r>
+      <w:r>
+        <w:t xml:space="preserve">While the interaction between cover crop and crop year was not significant, there was an amplification of the differences over time (Figure 1). </w:t>
+      </w:r>
+      <w:r>
+        <w:t>On average, the RadM cover crop treatment exhibited 8% higher crop yields compared to all other cover crop treatments</w:t>
       </w:r>
       <w:r>
         <w:t xml:space="preserve"> (p&lt;0.001)</w:t>
@@ -9792,6 +10159,7 @@
           <w:i/>
           <w:iCs/>
         </w:rPr>
+        <w:lastRenderedPageBreak/>
         <w:t>3.2.1 Biomass</w:t>
       </w:r>
     </w:p>
@@ -9818,11 +10186,7 @@
         <w:t xml:space="preserve">(p&lt;0.001). </w:t>
       </w:r>
       <w:r>
-        <w:t xml:space="preserve">In 2018, average fall biomass </w:t>
-      </w:r>
-      <w:r>
-        <w:lastRenderedPageBreak/>
-        <w:t>production was 2.27 Mg ha</w:t>
+        <w:t>In 2018, average fall biomass production was 2.27 Mg ha</w:t>
       </w:r>
       <w:r>
         <w:rPr>
@@ -9873,7 +10237,25 @@
         <w:t xml:space="preserve">, resulting in significant year interactions. </w:t>
       </w:r>
       <w:r>
-        <w:t xml:space="preserve">On average, increasing tillage intensity significantly decreased fall biomass by 27% and 9% when moving from no-till to surface tillage, and surface to inversion respectively. </w:t>
+        <w:t xml:space="preserve">On average, increasing tillage intensity significantly decreased fall biomass by 27% and 9% when moving from </w:t>
+      </w:r>
+      <w:r>
+        <w:t>NT</w:t>
+      </w:r>
+      <w:r>
+        <w:t xml:space="preserve"> to </w:t>
+      </w:r>
+      <w:r>
+        <w:t>SURF</w:t>
+      </w:r>
+      <w:r>
+        <w:t xml:space="preserve"> tillage, and </w:t>
+      </w:r>
+      <w:r>
+        <w:t>SURF</w:t>
+      </w:r>
+      <w:r>
+        <w:t xml:space="preserve"> to inversion respectively. </w:t>
       </w:r>
       <w:r>
         <w:t xml:space="preserve">Tillage effects on biomass were strongest in the RadM and RadL </w:t>
@@ -10014,70 +10396,106 @@
                 <w:i/>
                 <w:iCs/>
               </w:rPr>
-              <w:t xml:space="preserve"> (Top) Fall biomass was not related to growing degree days (GDDs, italic number in red</w:t>
+              <w:t xml:space="preserve"> (Top) Fall biomass</w:t>
             </w:r>
             <w:r>
               <w:rPr>
                 <w:i/>
                 <w:iCs/>
               </w:rPr>
-              <w:t>) and exhibited complex treatment interactions (</w:t>
+              <w:t xml:space="preserve"> (estimated marginal means with standard errors)</w:t>
             </w:r>
             <w:r>
               <w:rPr>
                 <w:i/>
                 <w:iCs/>
               </w:rPr>
-              <w:t>different</w:t>
+              <w:t xml:space="preserve"> was not related to growing degree days (GDDs, italic number in red</w:t>
             </w:r>
             <w:r>
               <w:rPr>
                 <w:i/>
                 <w:iCs/>
               </w:rPr>
-              <w:t xml:space="preserve"> </w:t>
+              <w:t>) and exhibited complex treatment interactions (</w:t>
             </w:r>
             <w:r>
               <w:rPr>
                 <w:i/>
                 <w:iCs/>
               </w:rPr>
-              <w:t>letters within a year indicate significant differences)</w:t>
+              <w:t>different</w:t>
             </w:r>
             <w:r>
               <w:rPr>
                 <w:i/>
                 <w:iCs/>
               </w:rPr>
-              <w:t xml:space="preserve">. (Bottom) </w:t>
+              <w:t xml:space="preserve"> </w:t>
             </w:r>
             <w:r>
               <w:rPr>
                 <w:i/>
                 <w:iCs/>
               </w:rPr>
-              <w:t>F</w:t>
+              <w:t>letters within a year indicate significant differences)</w:t>
             </w:r>
             <w:r>
               <w:rPr>
                 <w:i/>
                 <w:iCs/>
               </w:rPr>
-              <w:t>all ground cover consisted mainly of cash crop volunteers</w:t>
+              <w:t xml:space="preserve">, but with the mid-season planted radish (RadM) exhibiting the highest biomass in all systems </w:t>
             </w:r>
             <w:r>
               <w:rPr>
                 <w:i/>
                 <w:iCs/>
               </w:rPr>
-              <w:t>, with cover crop coverage ranging from 1-</w:t>
+              <w:lastRenderedPageBreak/>
+              <w:t>and years</w:t>
             </w:r>
             <w:r>
               <w:rPr>
                 <w:i/>
                 <w:iCs/>
               </w:rPr>
+              <w:t xml:space="preserve">. (Bottom) </w:t>
+            </w:r>
+            <w:r>
+              <w:rPr>
+                <w:i/>
+                <w:iCs/>
+              </w:rPr>
+              <w:t>F</w:t>
+            </w:r>
+            <w:r>
+              <w:rPr>
+                <w:i/>
+                <w:iCs/>
+              </w:rPr>
+              <w:t>all ground cover consisted mainly of cash crop volunteers</w:t>
+            </w:r>
+            <w:r>
+              <w:rPr>
+                <w:i/>
+                <w:iCs/>
+              </w:rPr>
+              <w:t>, with cover crop coverage ranging from 1-</w:t>
+            </w:r>
+            <w:r>
+              <w:rPr>
+                <w:i/>
+                <w:iCs/>
+              </w:rPr>
               <w:t>72% (white labels)</w:t>
+            </w:r>
+            <w:r>
+              <w:rPr>
+                <w:i/>
+                <w:iCs/>
+              </w:rPr>
+              <w:t xml:space="preserve"> and exhibiting crossover interactions with year</w:t>
             </w:r>
             <w:r>
               <w:rPr>
@@ -10114,12 +10532,25 @@
     <w:p>
       <w:pPr>
         <w:spacing w:line="360" w:lineRule="auto"/>
-        <w:rPr>
-          <w:lang w:val="en-US"/>
-        </w:rPr>
-      </w:pPr>
-      <w:r>
-        <w:lastRenderedPageBreak/>
+      </w:pPr>
+      <w:r>
+        <w:t xml:space="preserve">Overall, soil coverage was dominated by cash crop volunteers (mean </w:t>
+      </w:r>
+      <w:r>
+        <w:t xml:space="preserve">coverage </w:t>
+      </w:r>
+      <w:r>
+        <w:t xml:space="preserve">of </w:t>
+      </w:r>
+      <w:r>
+        <w:t xml:space="preserve">45%) followed by cover crops (mean of 9%), and weeds contributed less than 1% of coverage. </w:t>
+      </w:r>
+    </w:p>
+    <w:p>
+      <w:pPr>
+        <w:spacing w:line="360" w:lineRule="auto"/>
+      </w:pPr>
+      <w:r>
         <w:t xml:space="preserve">The percentage of the soil covered by vegetation </w:t>
       </w:r>
       <w:r>
@@ -10158,61 +10589,72 @@
       <w:r>
         <w:t xml:space="preserve">. </w:t>
       </w:r>
-      <w:r>
-        <w:t xml:space="preserve">Overall, </w:t>
-      </w:r>
-      <w:r>
-        <w:t>soil coverage by cover crop</w:t>
+    </w:p>
+    <w:p>
+      <w:pPr>
+        <w:spacing w:line="360" w:lineRule="auto"/>
+        <w:rPr>
+          <w:lang w:val="en-US"/>
+        </w:rPr>
+      </w:pPr>
+      <w:r>
+        <w:t xml:space="preserve">The percentage of cover provided by cover crops </w:t>
+      </w:r>
+      <w:r>
+        <w:t>varied significantly by cover crop treatment</w:t>
+      </w:r>
+      <w:r>
+        <w:t xml:space="preserve"> and its interaction with year</w:t>
+      </w:r>
+      <w:r>
+        <w:t xml:space="preserve"> (p&lt;0.001)</w:t>
+      </w:r>
+      <w:r>
+        <w:t>, while t</w:t>
+      </w:r>
+      <w:r>
+        <w:t xml:space="preserve">illage, residue, nor their interactions had significant impacts on </w:t>
+      </w:r>
+      <w:r>
+        <w:t>how</w:t>
+      </w:r>
+      <w:r>
+        <w:t xml:space="preserve"> </w:t>
+      </w:r>
+      <w:r>
+        <w:t xml:space="preserve">the </w:t>
+      </w:r>
+      <w:r>
+        <w:t xml:space="preserve">cover crop </w:t>
+      </w:r>
+      <w:r>
+        <w:t>contributed to coverage</w:t>
+      </w:r>
+      <w:r>
+        <w:t>. The</w:t>
+      </w:r>
+      <w:r>
+        <w:t xml:space="preserve"> interaction between cover crop treatment and year was</w:t>
+      </w:r>
+      <w:r>
+        <w:t xml:space="preserve"> driven by </w:t>
+      </w:r>
+      <w:r>
+        <w:t xml:space="preserve">a cross-over effect in </w:t>
+      </w:r>
+      <w:r>
+        <w:t xml:space="preserve">MixE: in 2018 the </w:t>
+      </w:r>
+      <w:r>
+        <w:t xml:space="preserve">MixE </w:t>
+      </w:r>
+      <w:r>
+        <w:t>cover crop</w:t>
       </w:r>
       <w:r>
         <w:t>s</w:t>
       </w:r>
       <w:r>
-        <w:t xml:space="preserve"> averaged </w:t>
-      </w:r>
-      <w:r>
-        <w:t xml:space="preserve">15%, </w:t>
-      </w:r>
-      <w:r>
-        <w:t xml:space="preserve">but this varied significantly by cover crop treatment (p&lt;0.001). </w:t>
-      </w:r>
-      <w:r>
-        <w:t xml:space="preserve">Tillage, residue, nor their interactions had significant impacts on </w:t>
-      </w:r>
-      <w:r>
-        <w:t>how</w:t>
-      </w:r>
-      <w:r>
-        <w:t xml:space="preserve"> </w:t>
-      </w:r>
-      <w:r>
-        <w:t xml:space="preserve">the </w:t>
-      </w:r>
-      <w:r>
-        <w:t>categories</w:t>
-      </w:r>
-      <w:r>
-        <w:t xml:space="preserve"> (cover crop, other) contributed to coverage</w:t>
-      </w:r>
-      <w:r>
-        <w:t xml:space="preserve">. The impact of cover crop treatment on </w:t>
-      </w:r>
-      <w:r>
-        <w:t xml:space="preserve">cover crop </w:t>
-      </w:r>
-      <w:r>
-        <w:t xml:space="preserve">coverage depended on the year, an effect driven by MixE: in 2018 the </w:t>
-      </w:r>
-      <w:r>
-        <w:t xml:space="preserve">MixE </w:t>
-      </w:r>
-      <w:r>
-        <w:t>cover crop</w:t>
-      </w:r>
-      <w:r>
-        <w:t>s</w:t>
-      </w:r>
-      <w:r>
         <w:t xml:space="preserve"> contributed an average of 21% (SE</w:t>
       </w:r>
       <w:r>
@@ -10249,27 +10691,18 @@
         <w:t>did not vary significantly by year</w:t>
       </w:r>
       <w:r>
-        <w:t>, with RadM having the highest cover crop coverage (50%, SE:4%), followed by RadL (25%, SE:4%), MixM (7%, SE:3%) and NoCC (&lt;1%, SE:3%)</w:t>
+        <w:t>, with RadM having the highest cover crop coverage</w:t>
+      </w:r>
+      <w:r>
+        <w:t xml:space="preserve"> across years</w:t>
+      </w:r>
+      <w:r>
+        <w:t xml:space="preserve"> (50%, SE:4%), followed by RadL (25%, SE:4%), MixM (7%, SE:3%) and NoCC (&lt;1%, SE:3%)</w:t>
       </w:r>
       <w:r>
         <w:t>.</w:t>
       </w:r>
       <w:r>
-        <w:t xml:space="preserve"> Cover crop coverage and volunteer/weed coverage was inversely correlated (</w:t>
-      </w:r>
-      <w:r>
-        <w:t>ρ</w:t>
-      </w:r>
-      <w:r>
-        <w:t xml:space="preserve"> = -0.88</w:t>
-      </w:r>
-      <w:r>
-        <w:t>).</w:t>
-      </w:r>
-      <w:r>
-        <w:rPr>
-          <w:lang w:val="en-US"/>
-        </w:rPr>
         <w:t xml:space="preserve"> </w:t>
       </w:r>
     </w:p>
@@ -10741,7 +11174,13 @@
         <w:t>-2</w:t>
       </w:r>
       <w:r>
-        <w:t xml:space="preserve">. There were complex treatment interactions, with a significant three-way interaction between year, tillage, and cover crop (p&lt;0.001) and a significant two-way interaction between year and residue (p&lt;0.001). Within the no-till system, MixE had </w:t>
+        <w:t xml:space="preserve">. There were complex treatment interactions, with a significant three-way interaction between year, tillage, and cover crop (p&lt;0.001) and a significant two-way interaction between year and residue (p&lt;0.001). Within the </w:t>
+      </w:r>
+      <w:r>
+        <w:t>NT</w:t>
+      </w:r>
+      <w:r>
+        <w:t xml:space="preserve"> system, MixE had </w:t>
       </w:r>
       <w:r>
         <w:t xml:space="preserve">significantly more </w:t>
@@ -10823,7 +11262,19 @@
         <w:rPr>
           <w:highlight w:val="yellow"/>
         </w:rPr>
-        <w:t>, followed by surface tillage systems</w:t>
+        <w:t xml:space="preserve">, followed by </w:t>
+      </w:r>
+      <w:r>
+        <w:rPr>
+          <w:highlight w:val="yellow"/>
+        </w:rPr>
+        <w:t>SURF</w:t>
+      </w:r>
+      <w:r>
+        <w:rPr>
+          <w:highlight w:val="yellow"/>
+        </w:rPr>
+        <w:t xml:space="preserve"> tillage systems</w:t>
       </w:r>
       <w:r>
         <w:rPr>
@@ -10872,7 +11323,19 @@
         <w:rPr>
           <w:highlight w:val="yellow"/>
         </w:rPr>
-        <w:t>, with the no-till systems having the smallest number of total weeds</w:t>
+        <w:t xml:space="preserve">, with the </w:t>
+      </w:r>
+      <w:r>
+        <w:rPr>
+          <w:highlight w:val="yellow"/>
+        </w:rPr>
+        <w:t>NT</w:t>
+      </w:r>
+      <w:r>
+        <w:rPr>
+          <w:highlight w:val="yellow"/>
+        </w:rPr>
+        <w:t xml:space="preserve"> systems having the smallest number of total weeds</w:t>
       </w:r>
       <w:r>
         <w:rPr>
@@ -10959,7 +11422,13 @@
         <w:t xml:space="preserve">. </w:t>
       </w:r>
       <w:r>
-        <w:t>The largest observed differences in total spring weed counts were in the no-till system, with MixE having 1.5-1.7 times more weeds compared to the other cover crop treatments.</w:t>
+        <w:t xml:space="preserve">The largest observed differences in total spring weed counts were in the </w:t>
+      </w:r>
+      <w:r>
+        <w:t>NT</w:t>
+      </w:r>
+      <w:r>
+        <w:t xml:space="preserve"> system, with MixE having 1.5-1.7 times more weeds compared to the other cover crop treatments.</w:t>
       </w:r>
     </w:p>
     <w:p>
@@ -11092,7 +11561,13 @@
               <w:t xml:space="preserve">There were no differences in total or perennial weed counts within the inversion tillage treatment (Inv), but in </w:t>
             </w:r>
             <w:r>
-              <w:t>the no-till and surface</w:t>
+              <w:t xml:space="preserve">the </w:t>
+            </w:r>
+            <w:r>
+              <w:t>NT</w:t>
+            </w:r>
+            <w:r>
+              <w:t xml:space="preserve"> and surface</w:t>
             </w:r>
             <w:r>
               <w:t xml:space="preserve"> (Surf)</w:t>
@@ -11101,10 +11576,7 @@
               <w:t xml:space="preserve"> tillage systems </w:t>
             </w:r>
             <w:r>
-              <w:t>t</w:t>
-            </w:r>
-            <w:r>
-              <w:t xml:space="preserve">he early-planted mix </w:t>
+              <w:t xml:space="preserve">the early-planted mix </w:t>
             </w:r>
             <w:r>
               <w:t>had significantly higher perennial weed counts</w:t>
@@ -11138,14 +11610,44 @@
         <w:spacing w:line="360" w:lineRule="auto"/>
       </w:pPr>
       <w:r>
-        <w:t xml:space="preserve">Despite having less total weeds, both no-till and surface tillage had significantly increased numbers of perennial weeds compared to inversion tillage. The perennial weeds were mainly CIRAR (82%, versus 18% EQUAR). Averaged over no-till and surface tillage treatments, the </w:t>
+        <w:t xml:space="preserve">Despite having less total weeds, both </w:t>
+      </w:r>
+      <w:r>
+        <w:t>NT</w:t>
+      </w:r>
+      <w:r>
+        <w:t xml:space="preserve"> and </w:t>
+      </w:r>
+      <w:r>
+        <w:t>SURF</w:t>
+      </w:r>
+      <w:r>
+        <w:t xml:space="preserve"> tillage had significantly increased numbers of perennial weeds compared to inversion tillage. The perennial weeds were mainly CIRAR (82%, versus 18% EQUAR). Averaged over </w:t>
+      </w:r>
+      <w:r>
+        <w:t>NT</w:t>
+      </w:r>
+      <w:r>
+        <w:t xml:space="preserve"> and </w:t>
+      </w:r>
+      <w:r>
+        <w:t>SURF</w:t>
+      </w:r>
+      <w:r>
+        <w:t xml:space="preserve"> tillage treatments, the </w:t>
       </w:r>
       <w:r>
         <w:lastRenderedPageBreak/>
         <w:t xml:space="preserve">number of perennial weeds in the MixE was 11 times higher (SE:6; p&lt;0.001) compared to the the NoCC treatment, and 2.6-8.6 times higher than the other cover crop treatments; these effects were erased in the inversion tillage treatment. The MixM had a borderline significant increase in perennial weeds compared to the NoCC </w:t>
       </w:r>
       <w:r>
-        <w:t xml:space="preserve">in the no-till system </w:t>
+        <w:t xml:space="preserve">in the </w:t>
+      </w:r>
+      <w:r>
+        <w:t>NT</w:t>
+      </w:r>
+      <w:r>
+        <w:t xml:space="preserve"> system </w:t>
       </w:r>
       <w:r>
         <w:t>(p=0.05), but all other treatments were not significantly different from the NoCC. The</w:t>
@@ -11163,13 +11665,7 @@
         <w:t xml:space="preserve">weeds, with more perennial weeds corresponding to lower faba bean yields </w:t>
       </w:r>
       <w:r>
-        <w:t xml:space="preserve">(see </w:t>
-      </w:r>
-      <w:r>
-        <w:t>supporting information</w:t>
-      </w:r>
-      <w:r>
-        <w:t>)</w:t>
+        <w:t>(see supporting information)</w:t>
       </w:r>
       <w:r>
         <w:t>.</w:t>
@@ -11230,7 +11726,19 @@
         <w:t xml:space="preserve">traw retention had no impact on the system’s pesticide use. </w:t>
       </w:r>
       <w:r>
-        <w:t xml:space="preserve">Inversion tillage had lower pesticide loads compared to no-till and surface tillage. </w:t>
+        <w:t xml:space="preserve">Inversion tillage had lower pesticide loads compared to </w:t>
+      </w:r>
+      <w:r>
+        <w:t>NT</w:t>
+      </w:r>
+      <w:r>
+        <w:t xml:space="preserve"> and </w:t>
+      </w:r>
+      <w:r>
+        <w:t>SURF</w:t>
+      </w:r>
+      <w:r>
+        <w:t xml:space="preserve"> tillage. </w:t>
       </w:r>
       <w:r>
         <w:t>In all systems</w:t>
@@ -11276,7 +11784,13 @@
         <w:spacing w:line="360" w:lineRule="auto"/>
       </w:pPr>
       <w:r>
-        <w:t>The system with the highest overall value (assuming equal weighting for all metrics) was the mid-season planted radish (RadM) implemented in a no-till system with retained residue (</w:t>
+        <w:t xml:space="preserve">The system with the highest overall value (assuming equal weighting for all metrics) was the mid-season planted radish (RadM) implemented in a </w:t>
+      </w:r>
+      <w:r>
+        <w:t>NT</w:t>
+      </w:r>
+      <w:r>
+        <w:t xml:space="preserve"> system with retained residue (</w:t>
       </w:r>
       <w:r>
         <w:rPr>
@@ -11286,13 +11800,28 @@
         <w:t>Figure 5</w:t>
       </w:r>
       <w:r>
-        <w:t>), while the system with the lowest overall value was the mid-season planted mixture (MixM) implemented in a no-till system with residue removal. Across tillage and residue management systems, the RadM was the best performing cover crop treatment, and the MixM the worst.</w:t>
+        <w:t xml:space="preserve">), while the system with the lowest overall value was the mid-season planted mixture (MixM) implemented in a </w:t>
+      </w:r>
+      <w:r>
+        <w:t>NT</w:t>
+      </w:r>
+      <w:r>
+        <w:t xml:space="preserve"> system with residue removal. Across tillage and residue management systems, the RadM was the best performing cover crop treatment, and the MixM the worst.</w:t>
       </w:r>
       <w:r>
         <w:t xml:space="preserve"> The early-planted mixture (MixE) performed well in the inversion tillage system, but poorly in the other tillage systems. The impact of residue management on the total value was marginal in the inversion tillage system, but residue retention in the </w:t>
       </w:r>
       <w:r>
-        <w:t xml:space="preserve">surface and no-till systems increased total value. </w:t>
+        <w:t>SURF</w:t>
+      </w:r>
+      <w:r>
+        <w:t xml:space="preserve"> and </w:t>
+      </w:r>
+      <w:r>
+        <w:t>NT</w:t>
+      </w:r>
+      <w:r>
+        <w:t xml:space="preserve"> systems increased total value. </w:t>
       </w:r>
     </w:p>
     <w:tbl>
@@ -14111,7 +14640,7 @@
 <file path=word/commentsExtended.xml><?xml version="1.0" encoding="utf-8"?>
 <w15:commentsEx xmlns:wpc="http://schemas.microsoft.com/office/word/2010/wordprocessingCanvas" xmlns:cx="http://schemas.microsoft.com/office/drawing/2014/chartex" xmlns:cx1="http://schemas.microsoft.com/office/drawing/2015/9/8/chartex" xmlns:cx2="http://schemas.microsoft.com/office/drawing/2015/10/21/chartex" xmlns:cx3="http://schemas.microsoft.com/office/drawing/2016/5/9/chartex" xmlns:cx4="http://schemas.microsoft.com/office/drawing/2016/5/10/chartex" xmlns:cx5="http://schemas.microsoft.com/office/drawing/2016/5/11/chartex" xmlns:cx6="http://schemas.microsoft.com/office/drawing/2016/5/12/chartex" xmlns:cx7="http://schemas.microsoft.com/office/drawing/2016/5/13/chartex" xmlns:cx8="http://schemas.microsoft.com/office/drawing/2016/5/14/chartex" xmlns:mc="http://schemas.openxmlformats.org/markup-compatibility/2006" xmlns:aink="http://schemas.microsoft.com/office/drawing/2016/ink" xmlns:am3d="http://schemas.microsoft.com/office/drawing/2017/model3d" xmlns:o="urn:schemas-microsoft-com:office:office" xmlns:oel="http://schemas.microsoft.com/office/2019/extlst" xmlns:r="http://schemas.openxmlformats.org/officeDocument/2006/relationships" xmlns:m="http://schemas.openxmlformats.org/officeDocument/2006/math" xmlns:v="urn:schemas-microsoft-com:vml" xmlns:wp14="http://schemas.microsoft.com/office/word/2010/wordprocessingDrawing" xmlns:wp="http://schemas.openxmlformats.org/drawingml/2006/wordprocessingDrawing" xmlns:w10="urn:schemas-microsoft-com:office:word" xmlns:w="http://schemas.openxmlformats.org/wordprocessingml/2006/main" xmlns:w14="http://schemas.microsoft.com/office/word/2010/wordml" xmlns:w15="http://schemas.microsoft.com/office/word/2012/wordml" xmlns:w16cex="http://schemas.microsoft.com/office/word/2018/wordml/cex" xmlns:w16cid="http://schemas.microsoft.com/office/word/2016/wordml/cid" xmlns:w16="http://schemas.microsoft.com/office/word/2018/wordml" xmlns:w16du="http://schemas.microsoft.com/office/word/2023/wordml/word16du" xmlns:w16sdtdh="http://schemas.microsoft.com/office/word/2020/wordml/sdtdatahash" xmlns:w16sdtfl="http://schemas.microsoft.com/office/word/2024/wordml/sdtformatlock" xmlns:w16se="http://schemas.microsoft.com/office/word/2015/wordml/symex" xmlns:wpg="http://schemas.microsoft.com/office/word/2010/wordprocessingGroup" xmlns:wpi="http://schemas.microsoft.com/office/word/2010/wordprocessingInk" xmlns:wne="http://schemas.microsoft.com/office/word/2006/wordml" xmlns:wps="http://schemas.microsoft.com/office/word/2010/wordprocessingShape" mc:Ignorable="w14 w15 w16se w16cid w16 w16cex w16sdtdh w16sdtfl w16du wp14">
   <w15:commentEx w15:paraId="7A375AD7" w15:done="0"/>
-  <w15:commentEx w15:paraId="302ABAD3" w15:done="0"/>
+  <w15:commentEx w15:paraId="6C81547D" w15:done="0"/>
   <w15:commentEx w15:paraId="30569D99" w15:done="0"/>
 </w15:commentsEx>
 </file>
@@ -14127,7 +14656,7 @@
 <file path=word/commentsIds.xml><?xml version="1.0" encoding="utf-8"?>
 <w16cid:commentsIds xmlns:wpc="http://schemas.microsoft.com/office/word/2010/wordprocessingCanvas" xmlns:cx="http://schemas.microsoft.com/office/drawing/2014/chartex" xmlns:cx1="http://schemas.microsoft.com/office/drawing/2015/9/8/chartex" xmlns:cx2="http://schemas.microsoft.com/office/drawing/2015/10/21/chartex" xmlns:cx3="http://schemas.microsoft.com/office/drawing/2016/5/9/chartex" xmlns:cx4="http://schemas.microsoft.com/office/drawing/2016/5/10/chartex" xmlns:cx5="http://schemas.microsoft.com/office/drawing/2016/5/11/chartex" xmlns:cx6="http://schemas.microsoft.com/office/drawing/2016/5/12/chartex" xmlns:cx7="http://schemas.microsoft.com/office/drawing/2016/5/13/chartex" xmlns:cx8="http://schemas.microsoft.com/office/drawing/2016/5/14/chartex" xmlns:mc="http://schemas.openxmlformats.org/markup-compatibility/2006" xmlns:aink="http://schemas.microsoft.com/office/drawing/2016/ink" xmlns:am3d="http://schemas.microsoft.com/office/drawing/2017/model3d" xmlns:o="urn:schemas-microsoft-com:office:office" xmlns:oel="http://schemas.microsoft.com/office/2019/extlst" xmlns:r="http://schemas.openxmlformats.org/officeDocument/2006/relationships" xmlns:m="http://schemas.openxmlformats.org/officeDocument/2006/math" xmlns:v="urn:schemas-microsoft-com:vml" xmlns:wp14="http://schemas.microsoft.com/office/word/2010/wordprocessingDrawing" xmlns:wp="http://schemas.openxmlformats.org/drawingml/2006/wordprocessingDrawing" xmlns:w10="urn:schemas-microsoft-com:office:word" xmlns:w="http://schemas.openxmlformats.org/wordprocessingml/2006/main" xmlns:w14="http://schemas.microsoft.com/office/word/2010/wordml" xmlns:w15="http://schemas.microsoft.com/office/word/2012/wordml" xmlns:w16cex="http://schemas.microsoft.com/office/word/2018/wordml/cex" xmlns:w16cid="http://schemas.microsoft.com/office/word/2016/wordml/cid" xmlns:w16="http://schemas.microsoft.com/office/word/2018/wordml" xmlns:w16du="http://schemas.microsoft.com/office/word/2023/wordml/word16du" xmlns:w16sdtdh="http://schemas.microsoft.com/office/word/2020/wordml/sdtdatahash" xmlns:w16sdtfl="http://schemas.microsoft.com/office/word/2024/wordml/sdtformatlock" xmlns:w16se="http://schemas.microsoft.com/office/word/2015/wordml/symex" xmlns:wpg="http://schemas.microsoft.com/office/word/2010/wordprocessingGroup" xmlns:wpi="http://schemas.microsoft.com/office/word/2010/wordprocessingInk" xmlns:wne="http://schemas.microsoft.com/office/word/2006/wordml" xmlns:wps="http://schemas.microsoft.com/office/word/2010/wordprocessingShape" mc:Ignorable="w14 w15 w16se w16cid w16 w16cex w16sdtdh w16sdtfl w16du wp14">
   <w16cid:commentId w16cid:paraId="7A375AD7" w16cid:durableId="0C976B4B"/>
-  <w16cid:commentId w16cid:paraId="302ABAD3" w16cid:durableId="33B89A46"/>
+  <w16cid:commentId w16cid:paraId="6C81547D" w16cid:durableId="33B89A46"/>
   <w16cid:commentId w16cid:paraId="30569D99" w16cid:durableId="0C509EE4"/>
 </w16cid:commentsIds>
 </file>

</xml_diff>